<commit_message>
Update detailed project report
</commit_message>
<xml_diff>
--- a/rapor/tarsau_proje_raporu.docx
+++ b/rapor/tarsau_proje_raporu.docx
@@ -63,9 +63,9 @@
         </w:tblBorders>
         <w:tblCellMar>
           <w:top w:w="90" w:type="dxa"/>
-          <w:start w:w="130" w:type="dxa"/>
+          <w:start w:w="120" w:type="dxa"/>
           <w:bottom w:w="90" w:type="dxa"/>
-          <w:end w:w="130" w:type="dxa"/>
+          <w:end w:w="120" w:type="dxa"/>
         </w:tblCellMar>
       </w:tblPr>
       <w:tblGrid>
@@ -75,7 +75,171 @@
       <w:tr>
         <w:tc>
           <w:tcPr>
-            <w:tcW w:type="dxa" w:w="2448"/>
+            <w:tcW w:type="dxa" w:w="2520"/>
+            <w:vAlign w:val="center"/>
+            <w:shd w:fill="F2F4F7"/>
+          </w:tcPr>
+          <w:p>
+            <w:pPr>
+              <w:spacing w:after="0"/>
+            </w:pPr>
+            <w:r>
+              <w:rPr>
+                <w:rFonts w:ascii="Calibri" w:hAnsi="Calibri" w:eastAsia="Calibri"/>
+                <w:b/>
+                <w:sz w:val="22"/>
+              </w:rPr>
+              <w:t>Öğrenci 1</w:t>
+            </w:r>
+          </w:p>
+        </w:tc>
+        <w:tc>
+          <w:tcPr>
+            <w:tcW w:type="dxa" w:w="6552"/>
+            <w:vAlign w:val="center"/>
+          </w:tcPr>
+          <w:p>
+            <w:pPr>
+              <w:spacing w:after="0"/>
+            </w:pPr>
+            <w:r>
+              <w:rPr>
+                <w:rFonts w:ascii="Calibri" w:hAnsi="Calibri" w:eastAsia="Calibri"/>
+                <w:b w:val="0"/>
+                <w:sz w:val="22"/>
+              </w:rPr>
+              <w:t>Doğan Kaya</w:t>
+            </w:r>
+          </w:p>
+        </w:tc>
+      </w:tr>
+      <w:tr>
+        <w:tc>
+          <w:tcPr>
+            <w:tcW w:type="dxa" w:w="2520"/>
+            <w:vAlign w:val="center"/>
+            <w:shd w:fill="F2F4F7"/>
+          </w:tcPr>
+          <w:p>
+            <w:pPr>
+              <w:spacing w:after="0"/>
+            </w:pPr>
+            <w:r>
+              <w:rPr>
+                <w:rFonts w:ascii="Calibri" w:hAnsi="Calibri" w:eastAsia="Calibri"/>
+                <w:b/>
+                <w:sz w:val="22"/>
+              </w:rPr>
+              <w:t>Öğrenci No 1</w:t>
+            </w:r>
+          </w:p>
+        </w:tc>
+        <w:tc>
+          <w:tcPr>
+            <w:tcW w:type="dxa" w:w="6552"/>
+            <w:vAlign w:val="center"/>
+          </w:tcPr>
+          <w:p>
+            <w:pPr>
+              <w:spacing w:after="0"/>
+            </w:pPr>
+            <w:r>
+              <w:rPr>
+                <w:rFonts w:ascii="Calibri" w:hAnsi="Calibri" w:eastAsia="Calibri"/>
+                <w:b w:val="0"/>
+                <w:sz w:val="22"/>
+              </w:rPr>
+              <w:t>Belirtilmedi</w:t>
+            </w:r>
+          </w:p>
+        </w:tc>
+      </w:tr>
+      <w:tr>
+        <w:tc>
+          <w:tcPr>
+            <w:tcW w:type="dxa" w:w="2520"/>
+            <w:vAlign w:val="center"/>
+            <w:shd w:fill="F2F4F7"/>
+          </w:tcPr>
+          <w:p>
+            <w:pPr>
+              <w:spacing w:after="0"/>
+            </w:pPr>
+            <w:r>
+              <w:rPr>
+                <w:rFonts w:ascii="Calibri" w:hAnsi="Calibri" w:eastAsia="Calibri"/>
+                <w:b/>
+                <w:sz w:val="22"/>
+              </w:rPr>
+              <w:t>Öğrenci 2</w:t>
+            </w:r>
+          </w:p>
+        </w:tc>
+        <w:tc>
+          <w:tcPr>
+            <w:tcW w:type="dxa" w:w="6552"/>
+            <w:vAlign w:val="center"/>
+          </w:tcPr>
+          <w:p>
+            <w:pPr>
+              <w:spacing w:after="0"/>
+            </w:pPr>
+            <w:r>
+              <w:rPr>
+                <w:rFonts w:ascii="Calibri" w:hAnsi="Calibri" w:eastAsia="Calibri"/>
+                <w:b w:val="0"/>
+                <w:sz w:val="22"/>
+              </w:rPr>
+              <w:t>Rabia Varol</w:t>
+            </w:r>
+          </w:p>
+        </w:tc>
+      </w:tr>
+      <w:tr>
+        <w:tc>
+          <w:tcPr>
+            <w:tcW w:type="dxa" w:w="2520"/>
+            <w:vAlign w:val="center"/>
+            <w:shd w:fill="F2F4F7"/>
+          </w:tcPr>
+          <w:p>
+            <w:pPr>
+              <w:spacing w:after="0"/>
+            </w:pPr>
+            <w:r>
+              <w:rPr>
+                <w:rFonts w:ascii="Calibri" w:hAnsi="Calibri" w:eastAsia="Calibri"/>
+                <w:b/>
+                <w:sz w:val="22"/>
+              </w:rPr>
+              <w:t>Öğrenci No 2</w:t>
+            </w:r>
+          </w:p>
+        </w:tc>
+        <w:tc>
+          <w:tcPr>
+            <w:tcW w:type="dxa" w:w="6552"/>
+            <w:vAlign w:val="center"/>
+          </w:tcPr>
+          <w:p>
+            <w:pPr>
+              <w:spacing w:after="0"/>
+            </w:pPr>
+            <w:r>
+              <w:rPr>
+                <w:rFonts w:ascii="Calibri" w:hAnsi="Calibri" w:eastAsia="Calibri"/>
+                <w:b w:val="0"/>
+                <w:sz w:val="22"/>
+              </w:rPr>
+              <w:t>Belirtilmedi</w:t>
+            </w:r>
+          </w:p>
+        </w:tc>
+      </w:tr>
+      <w:tr>
+        <w:tc>
+          <w:tcPr>
+            <w:tcW w:type="dxa" w:w="2520"/>
             <w:vAlign w:val="center"/>
             <w:shd w:fill="F2F4F7"/>
           </w:tcPr>
@@ -95,7 +259,7 @@
         </w:tc>
         <w:tc>
           <w:tcPr>
-            <w:tcW w:type="dxa" w:w="6623"/>
+            <w:tcW w:type="dxa" w:w="6552"/>
             <w:vAlign w:val="center"/>
           </w:tcPr>
           <w:p>
@@ -108,7 +272,7 @@
                 <w:b w:val="0"/>
                 <w:sz w:val="22"/>
               </w:rPr>
-              <w:t>Sıkıştırma yapmadan ASCII metin dosyalarını .sau arşivinde birleştirme ve geri açma</w:t>
+              <w:t>ASCII metin dosyalarını sıkıştırmadan .sau arşivinde birleştirme ve geri açma</w:t>
             </w:r>
           </w:p>
         </w:tc>
@@ -116,48 +280,7 @@
       <w:tr>
         <w:tc>
           <w:tcPr>
-            <w:tcW w:type="dxa" w:w="2448"/>
-            <w:vAlign w:val="center"/>
-            <w:shd w:fill="F2F4F7"/>
-          </w:tcPr>
-          <w:p>
-            <w:pPr>
-              <w:spacing w:after="0"/>
-            </w:pPr>
-            <w:r>
-              <w:rPr>
-                <w:rFonts w:ascii="Calibri" w:hAnsi="Calibri" w:eastAsia="Calibri"/>
-                <w:b/>
-                <w:sz w:val="22"/>
-              </w:rPr>
-              <w:t>Program</w:t>
-            </w:r>
-          </w:p>
-        </w:tc>
-        <w:tc>
-          <w:tcPr>
-            <w:tcW w:type="dxa" w:w="6623"/>
-            <w:vAlign w:val="center"/>
-          </w:tcPr>
-          <w:p>
-            <w:pPr>
-              <w:spacing w:after="0"/>
-            </w:pPr>
-            <w:r>
-              <w:rPr>
-                <w:rFonts w:ascii="Calibri" w:hAnsi="Calibri" w:eastAsia="Calibri"/>
-                <w:b w:val="0"/>
-                <w:sz w:val="22"/>
-              </w:rPr>
-              <w:t>tarsau</w:t>
-            </w:r>
-          </w:p>
-        </w:tc>
-      </w:tr>
-      <w:tr>
-        <w:tc>
-          <w:tcPr>
-            <w:tcW w:type="dxa" w:w="2448"/>
+            <w:tcW w:type="dxa" w:w="2520"/>
             <w:vAlign w:val="center"/>
             <w:shd w:fill="F2F4F7"/>
           </w:tcPr>
@@ -177,7 +300,7 @@
         </w:tc>
         <w:tc>
           <w:tcPr>
-            <w:tcW w:type="dxa" w:w="6623"/>
+            <w:tcW w:type="dxa" w:w="6552"/>
             <w:vAlign w:val="center"/>
           </w:tcPr>
           <w:p>
@@ -198,7 +321,7 @@
       <w:tr>
         <w:tc>
           <w:tcPr>
-            <w:tcW w:type="dxa" w:w="2448"/>
+            <w:tcW w:type="dxa" w:w="2520"/>
             <w:vAlign w:val="center"/>
             <w:shd w:fill="F2F4F7"/>
           </w:tcPr>
@@ -212,13 +335,13 @@
                 <w:b/>
                 <w:sz w:val="22"/>
               </w:rPr>
-              <w:t>Kaynak depo</w:t>
+              <w:t>GitHub</w:t>
             </w:r>
           </w:p>
         </w:tc>
         <w:tc>
           <w:tcPr>
-            <w:tcW w:type="dxa" w:w="6623"/>
+            <w:tcW w:type="dxa" w:w="6552"/>
             <w:vAlign w:val="center"/>
           </w:tcPr>
           <w:p>
@@ -231,7 +354,7 @@
                 <w:b w:val="0"/>
                 <w:sz w:val="22"/>
               </w:rPr>
-              <w:t>Bu çalışma alanında .git/GitHub remote bilgisi bulunmadı; sahte link eklenmedi</w:t>
+              <w:t>https://github.com/kayadogan1/Sau-Tar</w:t>
             </w:r>
           </w:p>
         </w:tc>
@@ -239,89 +362,7 @@
       <w:tr>
         <w:tc>
           <w:tcPr>
-            <w:tcW w:type="dxa" w:w="2448"/>
-            <w:vAlign w:val="center"/>
-            <w:shd w:fill="F2F4F7"/>
-          </w:tcPr>
-          <w:p>
-            <w:pPr>
-              <w:spacing w:after="0"/>
-            </w:pPr>
-            <w:r>
-              <w:rPr>
-                <w:rFonts w:ascii="Calibri" w:hAnsi="Calibri" w:eastAsia="Calibri"/>
-                <w:b/>
-                <w:sz w:val="22"/>
-              </w:rPr>
-              <w:t>Teslim tarihi</w:t>
-            </w:r>
-          </w:p>
-        </w:tc>
-        <w:tc>
-          <w:tcPr>
-            <w:tcW w:type="dxa" w:w="6623"/>
-            <w:vAlign w:val="center"/>
-          </w:tcPr>
-          <w:p>
-            <w:pPr>
-              <w:spacing w:after="0"/>
-            </w:pPr>
-            <w:r>
-              <w:rPr>
-                <w:rFonts w:ascii="Calibri" w:hAnsi="Calibri" w:eastAsia="Calibri"/>
-                <w:b w:val="0"/>
-                <w:sz w:val="22"/>
-              </w:rPr>
-              <w:t>24 Mayıs 2026 23:59</w:t>
-            </w:r>
-          </w:p>
-        </w:tc>
-      </w:tr>
-      <w:tr>
-        <w:tc>
-          <w:tcPr>
-            <w:tcW w:type="dxa" w:w="2448"/>
-            <w:vAlign w:val="center"/>
-            <w:shd w:fill="F2F4F7"/>
-          </w:tcPr>
-          <w:p>
-            <w:pPr>
-              <w:spacing w:after="0"/>
-            </w:pPr>
-            <w:r>
-              <w:rPr>
-                <w:rFonts w:ascii="Calibri" w:hAnsi="Calibri" w:eastAsia="Calibri"/>
-                <w:b/>
-                <w:sz w:val="22"/>
-              </w:rPr>
-              <w:t>Test özeti</w:t>
-            </w:r>
-          </w:p>
-        </w:tc>
-        <w:tc>
-          <w:tcPr>
-            <w:tcW w:type="dxa" w:w="6623"/>
-            <w:vAlign w:val="center"/>
-          </w:tcPr>
-          <w:p>
-            <w:pPr>
-              <w:spacing w:after="0"/>
-            </w:pPr>
-            <w:r>
-              <w:rPr>
-                <w:rFonts w:ascii="Calibri" w:hAnsi="Calibri" w:eastAsia="Calibri"/>
-                <w:b w:val="0"/>
-                <w:sz w:val="22"/>
-              </w:rPr>
-              <w:t>22 uçtan uca senaryo ve make test başarıyla tamamlandı</w:t>
-            </w:r>
-          </w:p>
-        </w:tc>
-      </w:tr>
-      <w:tr>
-        <w:tc>
-          <w:tcPr>
-            <w:tcW w:type="dxa" w:w="2448"/>
+            <w:tcW w:type="dxa" w:w="2520"/>
             <w:vAlign w:val="center"/>
             <w:shd w:fill="F2F4F7"/>
           </w:tcPr>
@@ -341,7 +382,7 @@
         </w:tc>
         <w:tc>
           <w:tcPr>
-            <w:tcW w:type="dxa" w:w="6623"/>
+            <w:tcW w:type="dxa" w:w="6552"/>
             <w:vAlign w:val="center"/>
           </w:tcPr>
           <w:p>
@@ -354,7 +395,7 @@
                 <w:b w:val="0"/>
                 <w:sz w:val="22"/>
               </w:rPr>
-              <w:t>19 Mayıs 2026</w:t>
+              <w:t>20 Mayıs 2026</w:t>
             </w:r>
           </w:p>
         </w:tc>
@@ -376,7 +417,7 @@
           <w:color w:val="2E74B5"/>
           <w:sz w:val="32"/>
         </w:rPr>
-        <w:t>1. Amaç ve Kapsam</w:t>
+        <w:t>1. Projenin Amacı ve Kapsamı</w:t>
       </w:r>
     </w:p>
     <w:p>
@@ -389,7 +430,20 @@
           <w:b w:val="0"/>
           <w:sz w:val="22"/>
         </w:rPr>
-        <w:t>Bu çalışmada tar/rar/zip benzeri çalışan fakat sıkıştırma yapmayan tarsau adlı komut satırı programı geliştirilmiştir. Program -b modu ile metin dosyalarını tek bir .sau arşivinde toplar, -a modu ile arşivi istenen dizine açar. Uygulama, ödev föyünde verilen ASCII dosya koşulu, 32 dosya sınırı, 200 MB toplam boyut sınırı, bozuk arşiv kontrolü ve dosya izinlerinin korunması gereksinimlerini kapsar.</w:t>
+        <w:t>Bu projede tar/rar/zip benzeri çalışan, fakat sıkıştırma yapmayan tarsau adlı bir komut satırı aracı geliştirilmiştir. Program, birden fazla ASCII metin dosyasını tek bir .sau dosyasında saklar ve daha sonra bu arşivden dosyaları içerikleri ve izinleri korunmuş şekilde geri çıkarır.</w:t>
+      </w:r>
+    </w:p>
+    <w:p>
+      <w:pPr>
+        <w:spacing w:before="0" w:after="120" w:line="264" w:lineRule="auto"/>
+      </w:pPr>
+      <w:r>
+        <w:rPr>
+          <w:rFonts w:ascii="Calibri" w:hAnsi="Calibri" w:eastAsia="Calibri"/>
+          <w:b w:val="0"/>
+          <w:sz w:val="22"/>
+        </w:rPr>
+        <w:t>Uygulama iki ana komut moduna sahiptir: -b modu arşiv oluşturur, -a modu arşiv açar. Proje kapsamında dosya sayısı, toplam boyut, ASCII uyumluluğu, bozuk arşiv kontrolü, hedef dizin oluşturma ve dosya izinlerini geri yükleme gibi gereksinimler ele alınmıştır.</w:t>
       </w:r>
     </w:p>
     <w:p>
@@ -422,9 +476,9 @@
         </w:tblBorders>
         <w:tblCellMar>
           <w:top w:w="75" w:type="dxa"/>
-          <w:start w:w="95" w:type="dxa"/>
+          <w:start w:w="90" w:type="dxa"/>
           <w:bottom w:w="75" w:type="dxa"/>
-          <w:end w:w="95" w:type="dxa"/>
+          <w:end w:w="90" w:type="dxa"/>
         </w:tblCellMar>
       </w:tblPr>
       <w:tblGrid>
@@ -436,7 +490,7 @@
       <w:tr>
         <w:tc>
           <w:tcPr>
-            <w:tcW w:type="dxa" w:w="648"/>
+            <w:tcW w:type="dxa" w:w="604"/>
             <w:vAlign w:val="center"/>
             <w:shd w:fill="F2F4F7"/>
           </w:tcPr>
@@ -449,7 +503,7 @@
               <w:rPr>
                 <w:rFonts w:ascii="Calibri" w:hAnsi="Calibri" w:eastAsia="Calibri"/>
                 <w:b/>
-                <w:sz w:val="19"/>
+                <w:sz w:val="18"/>
               </w:rPr>
               <w:t>No</w:t>
             </w:r>
@@ -457,7 +511,7 @@
         </w:tc>
         <w:tc>
           <w:tcPr>
-            <w:tcW w:type="dxa" w:w="2808"/>
+            <w:tcW w:type="dxa" w:w="2520"/>
             <w:vAlign w:val="center"/>
             <w:shd w:fill="F2F4F7"/>
           </w:tcPr>
@@ -470,7 +524,7 @@
               <w:rPr>
                 <w:rFonts w:ascii="Calibri" w:hAnsi="Calibri" w:eastAsia="Calibri"/>
                 <w:b/>
-                <w:sz w:val="19"/>
+                <w:sz w:val="18"/>
               </w:rPr>
               <w:t>Gereksinim</w:t>
             </w:r>
@@ -478,7 +532,7 @@
         </w:tc>
         <w:tc>
           <w:tcPr>
-            <w:tcW w:type="dxa" w:w="4608"/>
+            <w:tcW w:type="dxa" w:w="4968"/>
             <w:vAlign w:val="center"/>
             <w:shd w:fill="F2F4F7"/>
           </w:tcPr>
@@ -491,7 +545,7 @@
               <w:rPr>
                 <w:rFonts w:ascii="Calibri" w:hAnsi="Calibri" w:eastAsia="Calibri"/>
                 <w:b/>
-                <w:sz w:val="19"/>
+                <w:sz w:val="18"/>
               </w:rPr>
               <w:t>Uygulamadaki karşılık</w:t>
             </w:r>
@@ -499,7 +553,7 @@
         </w:tc>
         <w:tc>
           <w:tcPr>
-            <w:tcW w:type="dxa" w:w="1007"/>
+            <w:tcW w:type="dxa" w:w="979"/>
             <w:vAlign w:val="center"/>
             <w:shd w:fill="F2F4F7"/>
           </w:tcPr>
@@ -512,7 +566,7 @@
               <w:rPr>
                 <w:rFonts w:ascii="Calibri" w:hAnsi="Calibri" w:eastAsia="Calibri"/>
                 <w:b/>
-                <w:sz w:val="19"/>
+                <w:sz w:val="18"/>
               </w:rPr>
               <w:t>Durum</w:t>
             </w:r>
@@ -553,7 +607,7 @@
                 <w:b w:val="0"/>
                 <w:sz w:val="17"/>
               </w:rPr>
-              <w:t>Komut satırında -b ile arşiv oluşturma</w:t>
+              <w:t>-b ile arşiv oluşturma</w:t>
             </w:r>
           </w:p>
         </w:tc>
@@ -571,7 +625,7 @@
                 <w:b w:val="0"/>
                 <w:sz w:val="17"/>
               </w:rPr>
-              <w:t>./tarsau -b dosya1 dosya2 ... -o arsiv.sau biçimi desteklenir.</w:t>
+              <w:t>./tarsau -b dosya1 dosya2 ... -o arsiv.sau desteklenir.</w:t>
             </w:r>
           </w:p>
         </w:tc>
@@ -648,7 +702,7 @@
                 <w:b w:val="0"/>
                 <w:sz w:val="17"/>
               </w:rPr>
-              <w:t>Çıktı yolu varsayılan olarak a.sau atanır.</w:t>
+              <w:t>Çıktı dosyası varsayılan olarak a.sau seçilir.</w:t>
             </w:r>
           </w:p>
         </w:tc>
@@ -707,7 +761,7 @@
                 <w:b w:val="0"/>
                 <w:sz w:val="17"/>
               </w:rPr>
-              <w:t>Yalnızca ASCII metin dosyalarını kabul etme</w:t>
+              <w:t>Sadece ASCII metin dosyası</w:t>
             </w:r>
           </w:p>
         </w:tc>
@@ -725,7 +779,7 @@
                 <w:b w:val="0"/>
                 <w:sz w:val="17"/>
               </w:rPr>
-              <w:t>NUL ve 127 üzeri baytlar uyumsuz format sayılır.</w:t>
+              <w:t>NUL veya 127 üzeri bayt tespit edilirse giriş reddedilir.</w:t>
             </w:r>
           </w:p>
         </w:tc>
@@ -784,7 +838,7 @@
                 <w:b w:val="0"/>
                 <w:sz w:val="17"/>
               </w:rPr>
-              <w:t>En fazla 32 giriş dosyası</w:t>
+              <w:t>En fazla 32 dosya</w:t>
             </w:r>
           </w:p>
         </w:tc>
@@ -802,7 +856,7 @@
                 <w:b w:val="0"/>
                 <w:sz w:val="17"/>
               </w:rPr>
-              <w:t>MAX_FILES sabiti 32'dir; fazlası hata üretir.</w:t>
+              <w:t>MAX_FILES sabiti ve argüman kontrolü ile sınır uygulanır.</w:t>
             </w:r>
           </w:p>
         </w:tc>
@@ -861,7 +915,7 @@
                 <w:b w:val="0"/>
                 <w:sz w:val="17"/>
               </w:rPr>
-              <w:t>Toplam giriş boyutu en fazla 200 MB</w:t>
+              <w:t>Toplam boyut en fazla 200 MB</w:t>
             </w:r>
           </w:p>
         </w:tc>
@@ -879,7 +933,7 @@
                 <w:b w:val="0"/>
                 <w:sz w:val="17"/>
               </w:rPr>
-              <w:t>MAX_TOTAL_SIZE sınırı her dosya sonrası kontrol edilir.</w:t>
+              <w:t>Her dosya sonrası toplam boyut MAX_TOTAL_SIZE ile karşılaştırılır.</w:t>
             </w:r>
           </w:p>
         </w:tc>
@@ -938,7 +992,7 @@
                 <w:b w:val="0"/>
                 <w:sz w:val="17"/>
               </w:rPr>
-              <w:t>.sau organizasyon bölümünü üretme</w:t>
+              <w:t>.sau organizasyon bölümü</w:t>
             </w:r>
           </w:p>
         </w:tc>
@@ -956,7 +1010,7 @@
                 <w:b w:val="0"/>
                 <w:sz w:val="17"/>
               </w:rPr>
-              <w:t>İlk 10 bayt organizasyon uzunluğu, devamında |ad,izin,boyut| kayıtları yazılır.</w:t>
+              <w:t>İlk 10 bayt metadata uzunluğunu, sonrası |ad,izin,boyut| kayıtlarını tutar.</w:t>
             </w:r>
           </w:p>
         </w:tc>
@@ -1033,7 +1087,7 @@
                 <w:b w:val="0"/>
                 <w:sz w:val="17"/>
               </w:rPr>
-              <w:t>./tarsau -a arsiv.sau [dizin] biçimi desteklenir.</w:t>
+              <w:t>./tarsau -a arsiv.sau [dizin] desteklenir.</w:t>
             </w:r>
           </w:p>
         </w:tc>
@@ -1110,7 +1164,7 @@
                 <w:b w:val="0"/>
                 <w:sz w:val="17"/>
               </w:rPr>
-              <w:t>mkdir_p göreceli, mutlak ve iç içe dizinleri oluşturur.</w:t>
+              <w:t>mkdir_p ile göreceli, mutlak ve iç içe dizinler oluşturulur.</w:t>
             </w:r>
           </w:p>
         </w:tc>
@@ -1169,7 +1223,7 @@
                 <w:b w:val="0"/>
                 <w:sz w:val="17"/>
               </w:rPr>
-              <w:t>Dosya izinlerini koruma</w:t>
+              <w:t>İzinleri koruma</w:t>
             </w:r>
           </w:p>
         </w:tc>
@@ -1187,7 +1241,7 @@
                 <w:b w:val="0"/>
                 <w:sz w:val="17"/>
               </w:rPr>
-              <w:t>stat ile izin okunur, açma sonunda chmod ile geri yüklenir.</w:t>
+              <w:t>stat ile okunan izinler chmod ile geri uygulanır.</w:t>
             </w:r>
           </w:p>
         </w:tc>
@@ -1246,7 +1300,7 @@
                 <w:b w:val="0"/>
                 <w:sz w:val="17"/>
               </w:rPr>
-              <w:t>Bozuk veya uygunsuz arşivde kontrollü çıkış</w:t>
+              <w:t>Bozuk arşivde güvenli çıkış</w:t>
             </w:r>
           </w:p>
         </w:tc>
@@ -1264,7 +1318,7 @@
                 <w:b w:val="0"/>
                 <w:sz w:val="17"/>
               </w:rPr>
-              <w:t>Uzantı, başlık, metadata ve toplam boyut doğrulanır.</w:t>
+              <w:t>Uzantı, başlık, metadata ve payload boyutu doğrulanır.</w:t>
             </w:r>
           </w:p>
         </w:tc>
@@ -1306,21 +1360,20 @@
           <w:color w:val="2E74B5"/>
           <w:sz w:val="32"/>
         </w:rPr>
-        <w:t>3. Kullanım</w:t>
+        <w:t>3. .sau Dosya Formatı</w:t>
       </w:r>
     </w:p>
     <w:p>
       <w:pPr>
-        <w:pStyle w:val="Heading2"/>
+        <w:spacing w:before="0" w:after="120" w:line="264" w:lineRule="auto"/>
       </w:pPr>
       <w:r>
         <w:rPr>
           <w:rFonts w:ascii="Calibri" w:hAnsi="Calibri" w:eastAsia="Calibri"/>
-          <w:b/>
-          <w:color w:val="2E74B5"/>
-          <w:sz w:val="26"/>
+          <w:b w:val="0"/>
+          <w:sz w:val="22"/>
         </w:rPr>
-        <w:t>3.1 Arşiv Oluşturma</w:t>
+        <w:t>.sau arşivi iki bölümden oluşur: organizasyon bölümü ve dosya içerikleri. İlk 10 bayt, yalnızca organizasyon bölümünün kaç bayt olduğunu ASCII sayı olarak saklar. Bu 10 baytlık alan kendi uzunluğuna dahil edilmez. Ardından dosya kayıtları gelir. Son kaydın hemen arkasından dosya içerikleri ayırıcı olmadan art arda yazılır.</w:t>
       </w:r>
     </w:p>
     <w:tbl>
@@ -1338,10 +1391,215 @@
           <w:insideV w:val="single" w:sz="4" w:space="0" w:color="D9E2EC"/>
         </w:tblBorders>
         <w:tblCellMar>
-          <w:top w:w="130" w:type="dxa"/>
-          <w:start w:w="160" w:type="dxa"/>
-          <w:bottom w:w="130" w:type="dxa"/>
-          <w:end w:w="160" w:type="dxa"/>
+          <w:top w:w="120" w:type="dxa"/>
+          <w:start w:w="150" w:type="dxa"/>
+          <w:bottom w:w="120" w:type="dxa"/>
+          <w:end w:w="150" w:type="dxa"/>
+        </w:tblCellMar>
+      </w:tblPr>
+      <w:tblGrid>
+        <w:gridCol w:w="9360"/>
+      </w:tblGrid>
+      <w:tr>
+        <w:tc>
+          <w:tcPr>
+            <w:tcW w:type="dxa" w:w="9072"/>
+            <w:vAlign w:val="center"/>
+            <w:shd w:fill="F4F6F9"/>
+          </w:tcPr>
+          <w:p>
+            <w:pPr>
+              <w:spacing w:after="0" w:line="240" w:lineRule="auto"/>
+            </w:pPr>
+            <w:r>
+              <w:rPr>
+                <w:rFonts w:ascii="Courier New" w:hAnsi="Courier New" w:eastAsia="Courier New"/>
+                <w:b w:val="0"/>
+                <w:sz w:val="17"/>
+              </w:rPr>
+              <w:t>0000000063|t1,0644,10|t2,0644,13|t3,0644,7|t4.txt,0644,13|t5.dat,0644,12|&lt;t1&gt;&lt;t2&gt;&lt;t3&gt;&lt;t4&gt;&lt;t5&gt;</w:t>
+            </w:r>
+          </w:p>
+        </w:tc>
+      </w:tr>
+    </w:tbl>
+    <w:p>
+      <w:pPr>
+        <w:spacing w:before="0" w:after="40" w:line="264" w:lineRule="auto"/>
+      </w:pPr>
+    </w:p>
+    <w:p>
+      <w:pPr>
+        <w:spacing w:before="0" w:after="120" w:line="264" w:lineRule="auto"/>
+      </w:pPr>
+      <w:r>
+        <w:rPr>
+          <w:rFonts w:ascii="Calibri" w:hAnsi="Calibri" w:eastAsia="Calibri"/>
+          <w:b w:val="0"/>
+          <w:sz w:val="22"/>
+        </w:rPr>
+        <w:t>Bu örnekte 0000000063 değeri, 10 bayttan sonra okunacak metadata bölümünün 63 bayt olduğunu gösterir. Kayıtlar arasında çift ayıraç yoktur; böylece boş metadata kaydı oluşmaz.</w:t>
+      </w:r>
+    </w:p>
+    <w:p>
+      <w:pPr>
+        <w:pStyle w:val="Heading1"/>
+      </w:pPr>
+      <w:r>
+        <w:rPr>
+          <w:rFonts w:ascii="Calibri" w:hAnsi="Calibri" w:eastAsia="Calibri"/>
+          <w:b/>
+          <w:color w:val="2E74B5"/>
+          <w:sz w:val="32"/>
+        </w:rPr>
+        <w:t>4. Program Mimarisi</w:t>
+      </w:r>
+    </w:p>
+    <w:p>
+      <w:pPr>
+        <w:pStyle w:val="ListBullet"/>
+        <w:spacing w:after="100" w:line="280" w:lineRule="auto"/>
+      </w:pPr>
+      <w:r>
+        <w:rPr>
+          <w:rFonts w:ascii="Calibri" w:hAnsi="Calibri" w:eastAsia="Calibri"/>
+          <w:b w:val="0"/>
+          <w:sz w:val="22"/>
+        </w:rPr>
+        <w:t>InputFile: Arşivlenecek dosyanın kaynak yolu, güvenli dosya adı, izinleri ve boyutunu taşır.</w:t>
+      </w:r>
+    </w:p>
+    <w:p>
+      <w:pPr>
+        <w:pStyle w:val="ListBullet"/>
+        <w:spacing w:after="100" w:line="280" w:lineRule="auto"/>
+      </w:pPr>
+      <w:r>
+        <w:rPr>
+          <w:rFonts w:ascii="Calibri" w:hAnsi="Calibri" w:eastAsia="Calibri"/>
+          <w:b w:val="0"/>
+          <w:sz w:val="22"/>
+        </w:rPr>
+        <w:t>ArchiveEntry: Arşiv açılırken metadata içinden okunan dosya adı, izin ve boyut bilgisini taşır.</w:t>
+      </w:r>
+    </w:p>
+    <w:p>
+      <w:pPr>
+        <w:pStyle w:val="ListBullet"/>
+        <w:spacing w:after="100" w:line="280" w:lineRule="auto"/>
+      </w:pPr>
+      <w:r>
+        <w:rPr>
+          <w:rFonts w:ascii="Calibri" w:hAnsi="Calibri" w:eastAsia="Calibri"/>
+          <w:b w:val="0"/>
+          <w:sz w:val="22"/>
+        </w:rPr>
+        <w:t>validate_ascii_text_file: Dosyayı bloklar halinde okuyarak ASCII dışı veya NUL bayt olup olmadığını denetler.</w:t>
+      </w:r>
+    </w:p>
+    <w:p>
+      <w:pPr>
+        <w:pStyle w:val="ListBullet"/>
+        <w:spacing w:after="100" w:line="280" w:lineRule="auto"/>
+      </w:pPr>
+      <w:r>
+        <w:rPr>
+          <w:rFonts w:ascii="Calibri" w:hAnsi="Calibri" w:eastAsia="Calibri"/>
+          <w:b w:val="0"/>
+          <w:sz w:val="22"/>
+        </w:rPr>
+        <w:t>append_metadata: Metadata string'ini tek ayıraçlı formatta üretir.</w:t>
+      </w:r>
+    </w:p>
+    <w:p>
+      <w:pPr>
+        <w:pStyle w:val="ListBullet"/>
+        <w:spacing w:after="100" w:line="280" w:lineRule="auto"/>
+      </w:pPr>
+      <w:r>
+        <w:rPr>
+          <w:rFonts w:ascii="Calibri" w:hAnsi="Calibri" w:eastAsia="Calibri"/>
+          <w:b w:val="0"/>
+          <w:sz w:val="22"/>
+        </w:rPr>
+        <w:t>copy_stream: Dosya içeriğini 64 KB tamponla kopyalar; büyük dosyalar belleğe komple alınmaz.</w:t>
+      </w:r>
+    </w:p>
+    <w:p>
+      <w:pPr>
+        <w:pStyle w:val="ListBullet"/>
+        <w:spacing w:after="100" w:line="280" w:lineRule="auto"/>
+      </w:pPr>
+      <w:r>
+        <w:rPr>
+          <w:rFonts w:ascii="Calibri" w:hAnsi="Calibri" w:eastAsia="Calibri"/>
+          <w:b w:val="0"/>
+          <w:sz w:val="22"/>
+        </w:rPr>
+        <w:t>parse_metadata: Organizasyon bölümünü ayrıştırır, format bozuksa arşivi reddeder.</w:t>
+      </w:r>
+    </w:p>
+    <w:p>
+      <w:pPr>
+        <w:pStyle w:val="ListBullet"/>
+        <w:spacing w:after="100" w:line="280" w:lineRule="auto"/>
+      </w:pPr>
+      <w:r>
+        <w:rPr>
+          <w:rFonts w:ascii="Calibri" w:hAnsi="Calibri" w:eastAsia="Calibri"/>
+          <w:b w:val="0"/>
+          <w:sz w:val="22"/>
+        </w:rPr>
+        <w:t>mkdir_p: Hedef dizin yoksa iç içe dizinleri güvenli biçimde oluşturur.</w:t>
+      </w:r>
+    </w:p>
+    <w:p>
+      <w:pPr>
+        <w:pStyle w:val="Heading1"/>
+      </w:pPr>
+      <w:r>
+        <w:rPr>
+          <w:rFonts w:ascii="Calibri" w:hAnsi="Calibri" w:eastAsia="Calibri"/>
+          <w:b/>
+          <w:color w:val="2E74B5"/>
+          <w:sz w:val="32"/>
+        </w:rPr>
+        <w:t>5. Komut Satırı Kullanımı</w:t>
+      </w:r>
+    </w:p>
+    <w:p>
+      <w:pPr>
+        <w:pStyle w:val="Heading2"/>
+      </w:pPr>
+      <w:r>
+        <w:rPr>
+          <w:rFonts w:ascii="Calibri" w:hAnsi="Calibri" w:eastAsia="Calibri"/>
+          <w:b/>
+          <w:color w:val="2E74B5"/>
+          <w:sz w:val="26"/>
+        </w:rPr>
+        <w:t>5.1 Arşiv Oluşturma</w:t>
+      </w:r>
+    </w:p>
+    <w:tbl>
+      <w:tblPr>
+        <w:tblW w:type="auto" w:w="0"/>
+        <w:jc w:val="center"/>
+        <w:tblLayout w:type="fixed"/>
+        <w:tblLook w:firstColumn="1" w:firstRow="1" w:lastColumn="0" w:lastRow="0" w:noHBand="0" w:noVBand="1" w:val="04A0"/>
+        <w:tblBorders>
+          <w:top w:val="single" w:sz="4" w:space="0" w:color="D9E2EC"/>
+          <w:left w:val="single" w:sz="4" w:space="0" w:color="D9E2EC"/>
+          <w:bottom w:val="single" w:sz="4" w:space="0" w:color="D9E2EC"/>
+          <w:right w:val="single" w:sz="4" w:space="0" w:color="D9E2EC"/>
+          <w:insideH w:val="single" w:sz="4" w:space="0" w:color="D9E2EC"/>
+          <w:insideV w:val="single" w:sz="4" w:space="0" w:color="D9E2EC"/>
+        </w:tblBorders>
+        <w:tblCellMar>
+          <w:top w:w="120" w:type="dxa"/>
+          <w:start w:w="150" w:type="dxa"/>
+          <w:bottom w:w="120" w:type="dxa"/>
+          <w:end w:w="150" w:type="dxa"/>
         </w:tblCellMar>
       </w:tblPr>
       <w:tblGrid>
@@ -1388,19 +1646,6 @@
     </w:p>
     <w:p>
       <w:pPr>
-        <w:spacing w:before="0" w:after="120" w:line="264" w:lineRule="auto"/>
-      </w:pPr>
-      <w:r>
-        <w:rPr>
-          <w:rFonts w:ascii="Calibri" w:hAnsi="Calibri" w:eastAsia="Calibri"/>
-          <w:b w:val="0"/>
-          <w:sz w:val="22"/>
-        </w:rPr>
-        <w:t>-o parametresi verilmediğinde program arşivi varsayılan olarak a.sau adıyla oluşturur.</w:t>
-      </w:r>
-    </w:p>
-    <w:p>
-      <w:pPr>
         <w:pStyle w:val="Heading2"/>
       </w:pPr>
       <w:r>
@@ -1410,7 +1655,7 @@
           <w:color w:val="2E74B5"/>
           <w:sz w:val="26"/>
         </w:rPr>
-        <w:t>3.2 Arşiv Açma</w:t>
+        <w:t>5.2 Varsayılan Arşiv Adı</w:t>
       </w:r>
     </w:p>
     <w:tbl>
@@ -1428,10 +1673,98 @@
           <w:insideV w:val="single" w:sz="4" w:space="0" w:color="D9E2EC"/>
         </w:tblBorders>
         <w:tblCellMar>
-          <w:top w:w="130" w:type="dxa"/>
-          <w:start w:w="160" w:type="dxa"/>
-          <w:bottom w:w="130" w:type="dxa"/>
-          <w:end w:w="160" w:type="dxa"/>
+          <w:top w:w="120" w:type="dxa"/>
+          <w:start w:w="150" w:type="dxa"/>
+          <w:bottom w:w="120" w:type="dxa"/>
+          <w:end w:w="150" w:type="dxa"/>
+        </w:tblCellMar>
+      </w:tblPr>
+      <w:tblGrid>
+        <w:gridCol w:w="9360"/>
+      </w:tblGrid>
+      <w:tr>
+        <w:tc>
+          <w:tcPr>
+            <w:tcW w:type="dxa" w:w="9072"/>
+            <w:vAlign w:val="center"/>
+            <w:shd w:fill="F4F6F9"/>
+          </w:tcPr>
+          <w:p>
+            <w:pPr>
+              <w:spacing w:after="0" w:line="240" w:lineRule="auto"/>
+            </w:pPr>
+            <w:r>
+              <w:rPr>
+                <w:rFonts w:ascii="Courier New" w:hAnsi="Courier New" w:eastAsia="Courier New"/>
+                <w:b w:val="0"/>
+                <w:sz w:val="17"/>
+              </w:rPr>
+              <w:t>$ ./tarsau -b t1 t2</w:t>
+            </w:r>
+            <w:r>
+              <w:br/>
+            </w:r>
+            <w:r>
+              <w:rPr>
+                <w:rFonts w:ascii="Courier New" w:hAnsi="Courier New" w:eastAsia="Courier New"/>
+                <w:b w:val="0"/>
+                <w:sz w:val="17"/>
+              </w:rPr>
+              <w:t>Dosyalar birleştirildi.</w:t>
+            </w:r>
+            <w:r>
+              <w:br/>
+            </w:r>
+            <w:r>
+              <w:rPr>
+                <w:rFonts w:ascii="Courier New" w:hAnsi="Courier New" w:eastAsia="Courier New"/>
+                <w:b w:val="0"/>
+                <w:sz w:val="17"/>
+              </w:rPr>
+              <w:t># Çıktı: a.sau</w:t>
+            </w:r>
+          </w:p>
+        </w:tc>
+      </w:tr>
+    </w:tbl>
+    <w:p>
+      <w:pPr>
+        <w:spacing w:before="0" w:after="40" w:line="264" w:lineRule="auto"/>
+      </w:pPr>
+    </w:p>
+    <w:p>
+      <w:pPr>
+        <w:pStyle w:val="Heading2"/>
+      </w:pPr>
+      <w:r>
+        <w:rPr>
+          <w:rFonts w:ascii="Calibri" w:hAnsi="Calibri" w:eastAsia="Calibri"/>
+          <w:b/>
+          <w:color w:val="2E74B5"/>
+          <w:sz w:val="26"/>
+        </w:rPr>
+        <w:t>5.3 Arşiv Açma</w:t>
+      </w:r>
+    </w:p>
+    <w:tbl>
+      <w:tblPr>
+        <w:tblW w:type="auto" w:w="0"/>
+        <w:jc w:val="center"/>
+        <w:tblLayout w:type="fixed"/>
+        <w:tblLook w:firstColumn="1" w:firstRow="1" w:lastColumn="0" w:lastRow="0" w:noHBand="0" w:noVBand="1" w:val="04A0"/>
+        <w:tblBorders>
+          <w:top w:val="single" w:sz="4" w:space="0" w:color="D9E2EC"/>
+          <w:left w:val="single" w:sz="4" w:space="0" w:color="D9E2EC"/>
+          <w:bottom w:val="single" w:sz="4" w:space="0" w:color="D9E2EC"/>
+          <w:right w:val="single" w:sz="4" w:space="0" w:color="D9E2EC"/>
+          <w:insideH w:val="single" w:sz="4" w:space="0" w:color="D9E2EC"/>
+          <w:insideV w:val="single" w:sz="4" w:space="0" w:color="D9E2EC"/>
+        </w:tblBorders>
+        <w:tblCellMar>
+          <w:top w:w="120" w:type="dxa"/>
+          <w:start w:w="150" w:type="dxa"/>
+          <w:bottom w:w="120" w:type="dxa"/>
+          <w:end w:w="150" w:type="dxa"/>
         </w:tblCellMar>
       </w:tblPr>
       <w:tblGrid>
@@ -1478,182 +1811,6 @@
     </w:p>
     <w:p>
       <w:pPr>
-        <w:spacing w:before="0" w:after="120" w:line="264" w:lineRule="auto"/>
-      </w:pPr>
-      <w:r>
-        <w:rPr>
-          <w:rFonts w:ascii="Calibri" w:hAnsi="Calibri" w:eastAsia="Calibri"/>
-          <w:b w:val="0"/>
-          <w:sz w:val="22"/>
-        </w:rPr>
-        <w:t>Dizin parametresi verilmediğinde dosyalar geçerli dizine açılır. Dizin adı göreceli veya mutlak olabilir.</w:t>
-      </w:r>
-    </w:p>
-    <w:p>
-      <w:pPr>
-        <w:pStyle w:val="Heading1"/>
-      </w:pPr>
-      <w:r>
-        <w:rPr>
-          <w:rFonts w:ascii="Calibri" w:hAnsi="Calibri" w:eastAsia="Calibri"/>
-          <w:b/>
-          <w:color w:val="2E74B5"/>
-          <w:sz w:val="32"/>
-        </w:rPr>
-        <w:t>4. Arşiv Formatı</w:t>
-      </w:r>
-    </w:p>
-    <w:p>
-      <w:pPr>
-        <w:spacing w:before="0" w:after="120" w:line="264" w:lineRule="auto"/>
-      </w:pPr>
-      <w:r>
-        <w:rPr>
-          <w:rFonts w:ascii="Calibri" w:hAnsi="Calibri" w:eastAsia="Calibri"/>
-          <w:b w:val="0"/>
-          <w:sz w:val="22"/>
-        </w:rPr>
-        <w:t>.sau dosyası iki bölümden oluşur. İlk bölüm organizasyon bilgisidir; ilk 10 bayt bu bölümün toplam uzunluğunu ASCII sayı olarak tutar. Bu uzunluğa 10 baytlık başlık alanı da dahildir. Devamında her dosya için |dosya_adı,izin,boyut| kaydı bulunur. İkinci bölümde dosya içerikleri ayırıcı karakter kullanılmadan, metadata kayıtlarındaki boyut değerleriyle çözülecek şekilde art arda yer alır.</w:t>
-      </w:r>
-    </w:p>
-    <w:tbl>
-      <w:tblPr>
-        <w:tblW w:type="auto" w:w="0"/>
-        <w:jc w:val="center"/>
-        <w:tblLayout w:type="fixed"/>
-        <w:tblLook w:firstColumn="1" w:firstRow="1" w:lastColumn="0" w:lastRow="0" w:noHBand="0" w:noVBand="1" w:val="04A0"/>
-        <w:tblBorders>
-          <w:top w:val="single" w:sz="4" w:space="0" w:color="D9E2EC"/>
-          <w:left w:val="single" w:sz="4" w:space="0" w:color="D9E2EC"/>
-          <w:bottom w:val="single" w:sz="4" w:space="0" w:color="D9E2EC"/>
-          <w:right w:val="single" w:sz="4" w:space="0" w:color="D9E2EC"/>
-          <w:insideH w:val="single" w:sz="4" w:space="0" w:color="D9E2EC"/>
-          <w:insideV w:val="single" w:sz="4" w:space="0" w:color="D9E2EC"/>
-        </w:tblBorders>
-        <w:tblCellMar>
-          <w:top w:w="130" w:type="dxa"/>
-          <w:start w:w="160" w:type="dxa"/>
-          <w:bottom w:w="130" w:type="dxa"/>
-          <w:end w:w="160" w:type="dxa"/>
-        </w:tblCellMar>
-      </w:tblPr>
-      <w:tblGrid>
-        <w:gridCol w:w="9360"/>
-      </w:tblGrid>
-      <w:tr>
-        <w:tc>
-          <w:tcPr>
-            <w:tcW w:type="dxa" w:w="9072"/>
-            <w:vAlign w:val="center"/>
-            <w:shd w:fill="F4F6F9"/>
-          </w:tcPr>
-          <w:p>
-            <w:pPr>
-              <w:spacing w:after="0" w:line="240" w:lineRule="auto"/>
-            </w:pPr>
-            <w:r>
-              <w:rPr>
-                <w:rFonts w:ascii="Courier New" w:hAnsi="Courier New" w:eastAsia="Courier New"/>
-                <w:b w:val="0"/>
-                <w:sz w:val="17"/>
-              </w:rPr>
-              <w:t>0000000064|t1,0644,52||t2,0644,70|&lt;t1 verisi&gt;&lt;t2 verisi&gt;</w:t>
-            </w:r>
-          </w:p>
-        </w:tc>
-      </w:tr>
-    </w:tbl>
-    <w:p>
-      <w:pPr>
-        <w:spacing w:before="0" w:after="40" w:line="264" w:lineRule="auto"/>
-      </w:pPr>
-    </w:p>
-    <w:p>
-      <w:pPr>
-        <w:pStyle w:val="Heading1"/>
-      </w:pPr>
-      <w:r>
-        <w:rPr>
-          <w:rFonts w:ascii="Calibri" w:hAnsi="Calibri" w:eastAsia="Calibri"/>
-          <w:b/>
-          <w:color w:val="2E74B5"/>
-          <w:sz w:val="32"/>
-        </w:rPr>
-        <w:t>5. Tasarım ve Kod Yapısı</w:t>
-      </w:r>
-    </w:p>
-    <w:p>
-      <w:pPr>
-        <w:pStyle w:val="ListBullet"/>
-        <w:spacing w:after="100" w:line="280" w:lineRule="auto"/>
-      </w:pPr>
-      <w:r>
-        <w:rPr>
-          <w:rFonts w:ascii="Calibri" w:hAnsi="Calibri" w:eastAsia="Calibri"/>
-          <w:b w:val="0"/>
-          <w:sz w:val="22"/>
-        </w:rPr>
-        <w:t>InputFile yapısı arşivlenecek dosyanın yolu, güvenli dosya adı, izinleri ve boyutunu taşır.</w:t>
-      </w:r>
-    </w:p>
-    <w:p>
-      <w:pPr>
-        <w:pStyle w:val="ListBullet"/>
-        <w:spacing w:after="100" w:line="280" w:lineRule="auto"/>
-      </w:pPr>
-      <w:r>
-        <w:rPr>
-          <w:rFonts w:ascii="Calibri" w:hAnsi="Calibri" w:eastAsia="Calibri"/>
-          <w:b w:val="0"/>
-          <w:sz w:val="22"/>
-        </w:rPr>
-        <w:t>ArchiveEntry yapısı arşiv açılırken metadata kayıtlarından okunan dosya adı, izin ve boyut bilgilerini taşır.</w:t>
-      </w:r>
-    </w:p>
-    <w:p>
-      <w:pPr>
-        <w:pStyle w:val="ListBullet"/>
-        <w:spacing w:after="100" w:line="280" w:lineRule="auto"/>
-      </w:pPr>
-      <w:r>
-        <w:rPr>
-          <w:rFonts w:ascii="Calibri" w:hAnsi="Calibri" w:eastAsia="Calibri"/>
-          <w:b w:val="0"/>
-          <w:sz w:val="22"/>
-        </w:rPr>
-        <w:t>copy_stream fonksiyonu dosya içeriklerini 64 KB tamponla kopyalar; böylece büyük dosyalar belleğe tamamen alınmaz.</w:t>
-      </w:r>
-    </w:p>
-    <w:p>
-      <w:pPr>
-        <w:pStyle w:val="ListBullet"/>
-        <w:spacing w:after="100" w:line="280" w:lineRule="auto"/>
-      </w:pPr>
-      <w:r>
-        <w:rPr>
-          <w:rFonts w:ascii="Calibri" w:hAnsi="Calibri" w:eastAsia="Calibri"/>
-          <w:b w:val="0"/>
-          <w:sz w:val="22"/>
-        </w:rPr>
-        <w:t>is_safe_archive_name fonksiyonu dosya adlarında ayırıcıları ve dizin kaçışı oluşturabilecek örüntüleri engeller.</w:t>
-      </w:r>
-    </w:p>
-    <w:p>
-      <w:pPr>
-        <w:pStyle w:val="ListBullet"/>
-        <w:spacing w:after="100" w:line="280" w:lineRule="auto"/>
-      </w:pPr>
-      <w:r>
-        <w:rPr>
-          <w:rFonts w:ascii="Calibri" w:hAnsi="Calibri" w:eastAsia="Calibri"/>
-          <w:b w:val="0"/>
-          <w:sz w:val="22"/>
-        </w:rPr>
-        <w:t>parse_metadata fonksiyonu organizasyon bölümünü kayıt kayıt ayrıştırır ve kayıt biçimi bozuksa işlemi durdurur.</w:t>
-      </w:r>
-    </w:p>
-    <w:p>
-      <w:pPr>
         <w:pStyle w:val="Heading1"/>
       </w:pPr>
       <w:r>
@@ -1677,7 +1834,7 @@
           <w:color w:val="2E74B5"/>
           <w:sz w:val="26"/>
         </w:rPr>
-        <w:t>6.1 ASCII ve Boyut Denetimi</w:t>
+        <w:t>6.1 ASCII Dosya Denetimi</w:t>
       </w:r>
     </w:p>
     <w:tbl>
@@ -1695,10 +1852,10 @@
           <w:insideV w:val="single" w:sz="4" w:space="0" w:color="D9E2EC"/>
         </w:tblBorders>
         <w:tblCellMar>
-          <w:top w:w="130" w:type="dxa"/>
-          <w:start w:w="160" w:type="dxa"/>
-          <w:bottom w:w="130" w:type="dxa"/>
-          <w:end w:w="160" w:type="dxa"/>
+          <w:top w:w="120" w:type="dxa"/>
+          <w:start w:w="150" w:type="dxa"/>
+          <w:bottom w:w="120" w:type="dxa"/>
+          <w:end w:w="150" w:type="dxa"/>
         </w:tblCellMar>
       </w:tblPr>
       <w:tblGrid>
@@ -1721,7 +1878,7 @@
                 <w:b w:val="0"/>
                 <w:sz w:val="17"/>
               </w:rPr>
-              <w:t>static int validate_ascii_text_file(const char *path, long long *size_out) {</w:t>
+              <w:t>if (buffer[i] == 0 || buffer[i] &gt; 127) {</w:t>
             </w:r>
             <w:r>
               <w:br/>
@@ -1732,7 +1889,7 @@
                 <w:b w:val="0"/>
                 <w:sz w:val="17"/>
               </w:rPr>
-              <w:t xml:space="preserve">    ...</w:t>
+              <w:t xml:space="preserve">    fclose(file);</w:t>
             </w:r>
             <w:r>
               <w:br/>
@@ -1743,62 +1900,7 @@
                 <w:b w:val="0"/>
                 <w:sz w:val="17"/>
               </w:rPr>
-              <w:t xml:space="preserve">    if (buffer[i] == 0 || buffer[i] &gt; 127) {</w:t>
-            </w:r>
-            <w:r>
-              <w:br/>
-            </w:r>
-            <w:r>
-              <w:rPr>
-                <w:rFonts w:ascii="Courier New" w:hAnsi="Courier New" w:eastAsia="Courier New"/>
-                <w:b w:val="0"/>
-                <w:sz w:val="17"/>
-              </w:rPr>
-              <w:t xml:space="preserve">        fclose(file);</w:t>
-            </w:r>
-            <w:r>
-              <w:br/>
-            </w:r>
-            <w:r>
-              <w:rPr>
-                <w:rFonts w:ascii="Courier New" w:hAnsi="Courier New" w:eastAsia="Courier New"/>
-                <w:b w:val="0"/>
-                <w:sz w:val="17"/>
-              </w:rPr>
-              <w:t xml:space="preserve">        return 1;</w:t>
-            </w:r>
-            <w:r>
-              <w:br/>
-            </w:r>
-            <w:r>
-              <w:rPr>
-                <w:rFonts w:ascii="Courier New" w:hAnsi="Courier New" w:eastAsia="Courier New"/>
-                <w:b w:val="0"/>
-                <w:sz w:val="17"/>
-              </w:rPr>
-              <w:t xml:space="preserve">    }</w:t>
-            </w:r>
-            <w:r>
-              <w:br/>
-            </w:r>
-            <w:r>
-              <w:rPr>
-                <w:rFonts w:ascii="Courier New" w:hAnsi="Courier New" w:eastAsia="Courier New"/>
-                <w:b w:val="0"/>
-                <w:sz w:val="17"/>
-              </w:rPr>
-              <w:t xml:space="preserve">    size += (long long) got;</w:t>
-            </w:r>
-            <w:r>
-              <w:br/>
-            </w:r>
-            <w:r>
-              <w:rPr>
-                <w:rFonts w:ascii="Courier New" w:hAnsi="Courier New" w:eastAsia="Courier New"/>
-                <w:b w:val="0"/>
-                <w:sz w:val="17"/>
-              </w:rPr>
-              <w:t xml:space="preserve">    ...</w:t>
+              <w:t xml:space="preserve">    return 1;</w:t>
             </w:r>
             <w:r>
               <w:br/>
@@ -1831,7 +1933,7 @@
           <w:color w:val="2E74B5"/>
           <w:sz w:val="26"/>
         </w:rPr>
-        <w:t>6.2 Metadata Kaydı ve Başlık Üretimi</w:t>
+        <w:t>6.2 Metadata Üretimi</w:t>
       </w:r>
     </w:p>
     <w:tbl>
@@ -1849,10 +1951,10 @@
           <w:insideV w:val="single" w:sz="4" w:space="0" w:color="D9E2EC"/>
         </w:tblBorders>
         <w:tblCellMar>
-          <w:top w:w="130" w:type="dxa"/>
-          <w:start w:w="160" w:type="dxa"/>
-          <w:bottom w:w="130" w:type="dxa"/>
-          <w:end w:w="160" w:type="dxa"/>
+          <w:top w:w="120" w:type="dxa"/>
+          <w:start w:w="150" w:type="dxa"/>
+          <w:bottom w:w="120" w:type="dxa"/>
+          <w:end w:w="150" w:type="dxa"/>
         </w:tblCellMar>
       </w:tblPr>
       <w:tblGrid>
@@ -1875,7 +1977,7 @@
                 <w:b w:val="0"/>
                 <w:sz w:val="17"/>
               </w:rPr>
-              <w:t>snprintf(record, sizeof(record), "|%s,%04o,%lld|",</w:t>
+              <w:t>if (*length == 0) {</w:t>
             </w:r>
             <w:r>
               <w:br/>
@@ -1886,7 +1988,7 @@
                 <w:b w:val="0"/>
                 <w:sz w:val="17"/>
               </w:rPr>
-              <w:t xml:space="preserve">         file-&gt;name, (unsigned int) (file-&gt;mode &amp; 0777), file-&gt;size);</w:t>
+              <w:t xml:space="preserve">    snprintf(record, sizeof(record), "|%s,%04o,%lld|", file-&gt;name, mode, file-&gt;size);</w:t>
             </w:r>
             <w:r>
               <w:br/>
@@ -1897,6 +1999,7 @@
                 <w:b w:val="0"/>
                 <w:sz w:val="17"/>
               </w:rPr>
+              <w:t>} else {</w:t>
             </w:r>
             <w:r>
               <w:br/>
@@ -1907,7 +2010,18 @@
                 <w:b w:val="0"/>
                 <w:sz w:val="17"/>
               </w:rPr>
-              <w:t>snprintf(header, sizeof(header), "%010zu", HEADER_WIDTH + metadata_length);</w:t>
+              <w:t xml:space="preserve">    snprintf(record, sizeof(record), "%s,%04o,%lld|", file-&gt;name, mode, file-&gt;size);</w:t>
+            </w:r>
+            <w:r>
+              <w:br/>
+            </w:r>
+            <w:r>
+              <w:rPr>
+                <w:rFonts w:ascii="Courier New" w:hAnsi="Courier New" w:eastAsia="Courier New"/>
+                <w:b w:val="0"/>
+                <w:sz w:val="17"/>
+              </w:rPr>
+              <w:t>}</w:t>
             </w:r>
           </w:p>
         </w:tc>
@@ -1929,7 +2043,7 @@
           <w:color w:val="2E74B5"/>
           <w:sz w:val="26"/>
         </w:rPr>
-        <w:t>6.3 Arşiv Açma ve İzinleri Geri Yükleme</w:t>
+        <w:t>6.3 İlk 10 Baytlık Uzunluk Alanı</w:t>
       </w:r>
     </w:p>
     <w:tbl>
@@ -1947,10 +2061,230 @@
           <w:insideV w:val="single" w:sz="4" w:space="0" w:color="D9E2EC"/>
         </w:tblBorders>
         <w:tblCellMar>
-          <w:top w:w="130" w:type="dxa"/>
-          <w:start w:w="160" w:type="dxa"/>
-          <w:bottom w:w="130" w:type="dxa"/>
-          <w:end w:w="160" w:type="dxa"/>
+          <w:top w:w="120" w:type="dxa"/>
+          <w:start w:w="150" w:type="dxa"/>
+          <w:bottom w:w="120" w:type="dxa"/>
+          <w:end w:w="150" w:type="dxa"/>
+        </w:tblCellMar>
+      </w:tblPr>
+      <w:tblGrid>
+        <w:gridCol w:w="9360"/>
+      </w:tblGrid>
+      <w:tr>
+        <w:tc>
+          <w:tcPr>
+            <w:tcW w:type="dxa" w:w="9072"/>
+            <w:vAlign w:val="center"/>
+            <w:shd w:fill="F4F6F9"/>
+          </w:tcPr>
+          <w:p>
+            <w:pPr>
+              <w:spacing w:after="0" w:line="240" w:lineRule="auto"/>
+            </w:pPr>
+            <w:r>
+              <w:rPr>
+                <w:rFonts w:ascii="Courier New" w:hAnsi="Courier New" w:eastAsia="Courier New"/>
+                <w:b w:val="0"/>
+                <w:sz w:val="17"/>
+              </w:rPr>
+              <w:t>snprintf(header, sizeof(header), "%010zu", metadata_length);</w:t>
+            </w:r>
+            <w:r>
+              <w:br/>
+            </w:r>
+            <w:r>
+              <w:rPr>
+                <w:rFonts w:ascii="Courier New" w:hAnsi="Courier New" w:eastAsia="Courier New"/>
+                <w:b w:val="0"/>
+                <w:sz w:val="17"/>
+              </w:rPr>
+              <w:t>fwrite(header, 1, HEADER_WIDTH, out);</w:t>
+            </w:r>
+            <w:r>
+              <w:br/>
+            </w:r>
+            <w:r>
+              <w:rPr>
+                <w:rFonts w:ascii="Courier New" w:hAnsi="Courier New" w:eastAsia="Courier New"/>
+                <w:b w:val="0"/>
+                <w:sz w:val="17"/>
+              </w:rPr>
+              <w:t>fwrite(metadata, 1, metadata_length, out);</w:t>
+            </w:r>
+          </w:p>
+        </w:tc>
+      </w:tr>
+    </w:tbl>
+    <w:p>
+      <w:pPr>
+        <w:spacing w:before="0" w:after="40" w:line="264" w:lineRule="auto"/>
+      </w:pPr>
+    </w:p>
+    <w:p>
+      <w:pPr>
+        <w:pStyle w:val="Heading2"/>
+      </w:pPr>
+      <w:r>
+        <w:rPr>
+          <w:rFonts w:ascii="Calibri" w:hAnsi="Calibri" w:eastAsia="Calibri"/>
+          <w:b/>
+          <w:color w:val="2E74B5"/>
+          <w:sz w:val="26"/>
+        </w:rPr>
+        <w:t>6.4 Metadata Ayrıştırma</w:t>
+      </w:r>
+    </w:p>
+    <w:tbl>
+      <w:tblPr>
+        <w:tblW w:type="auto" w:w="0"/>
+        <w:jc w:val="center"/>
+        <w:tblLayout w:type="fixed"/>
+        <w:tblLook w:firstColumn="1" w:firstRow="1" w:lastColumn="0" w:lastRow="0" w:noHBand="0" w:noVBand="1" w:val="04A0"/>
+        <w:tblBorders>
+          <w:top w:val="single" w:sz="4" w:space="0" w:color="D9E2EC"/>
+          <w:left w:val="single" w:sz="4" w:space="0" w:color="D9E2EC"/>
+          <w:bottom w:val="single" w:sz="4" w:space="0" w:color="D9E2EC"/>
+          <w:right w:val="single" w:sz="4" w:space="0" w:color="D9E2EC"/>
+          <w:insideH w:val="single" w:sz="4" w:space="0" w:color="D9E2EC"/>
+          <w:insideV w:val="single" w:sz="4" w:space="0" w:color="D9E2EC"/>
+        </w:tblBorders>
+        <w:tblCellMar>
+          <w:top w:w="120" w:type="dxa"/>
+          <w:start w:w="150" w:type="dxa"/>
+          <w:bottom w:w="120" w:type="dxa"/>
+          <w:end w:w="150" w:type="dxa"/>
+        </w:tblCellMar>
+      </w:tblPr>
+      <w:tblGrid>
+        <w:gridCol w:w="9360"/>
+      </w:tblGrid>
+      <w:tr>
+        <w:tc>
+          <w:tcPr>
+            <w:tcW w:type="dxa" w:w="9072"/>
+            <w:vAlign w:val="center"/>
+            <w:shd w:fill="F4F6F9"/>
+          </w:tcPr>
+          <w:p>
+            <w:pPr>
+              <w:spacing w:after="0" w:line="240" w:lineRule="auto"/>
+            </w:pPr>
+            <w:r>
+              <w:rPr>
+                <w:rFonts w:ascii="Courier New" w:hAnsi="Courier New" w:eastAsia="Courier New"/>
+                <w:b w:val="0"/>
+                <w:sz w:val="17"/>
+              </w:rPr>
+              <w:t>if (metadata_length &lt; 2 || metadata[0] != '|' || metadata[metadata_length - 1] != '|') {</w:t>
+            </w:r>
+            <w:r>
+              <w:br/>
+            </w:r>
+            <w:r>
+              <w:rPr>
+                <w:rFonts w:ascii="Courier New" w:hAnsi="Courier New" w:eastAsia="Courier New"/>
+                <w:b w:val="0"/>
+                <w:sz w:val="17"/>
+              </w:rPr>
+              <w:t xml:space="preserve">    return -1;</w:t>
+            </w:r>
+            <w:r>
+              <w:br/>
+            </w:r>
+            <w:r>
+              <w:rPr>
+                <w:rFonts w:ascii="Courier New" w:hAnsi="Courier New" w:eastAsia="Courier New"/>
+                <w:b w:val="0"/>
+                <w:sz w:val="17"/>
+              </w:rPr>
+              <w:t>}</w:t>
+            </w:r>
+            <w:r>
+              <w:br/>
+            </w:r>
+            <w:r>
+              <w:rPr>
+                <w:rFonts w:ascii="Courier New" w:hAnsi="Courier New" w:eastAsia="Courier New"/>
+                <w:b w:val="0"/>
+                <w:sz w:val="17"/>
+              </w:rPr>
+              <w:t>name_start = metadata + pos;</w:t>
+            </w:r>
+            <w:r>
+              <w:br/>
+            </w:r>
+            <w:r>
+              <w:rPr>
+                <w:rFonts w:ascii="Courier New" w:hAnsi="Courier New" w:eastAsia="Courier New"/>
+                <w:b w:val="0"/>
+                <w:sz w:val="17"/>
+              </w:rPr>
+              <w:t>comma1 = strchr(name_start, ',');</w:t>
+            </w:r>
+            <w:r>
+              <w:br/>
+            </w:r>
+            <w:r>
+              <w:rPr>
+                <w:rFonts w:ascii="Courier New" w:hAnsi="Courier New" w:eastAsia="Courier New"/>
+                <w:b w:val="0"/>
+                <w:sz w:val="17"/>
+              </w:rPr>
+              <w:t>comma2 = strchr(comma1 + 1, ',');</w:t>
+            </w:r>
+            <w:r>
+              <w:br/>
+            </w:r>
+            <w:r>
+              <w:rPr>
+                <w:rFonts w:ascii="Courier New" w:hAnsi="Courier New" w:eastAsia="Courier New"/>
+                <w:b w:val="0"/>
+                <w:sz w:val="17"/>
+              </w:rPr>
+              <w:t>end_bar = strchr(comma2 + 1, '|');</w:t>
+            </w:r>
+          </w:p>
+        </w:tc>
+      </w:tr>
+    </w:tbl>
+    <w:p>
+      <w:pPr>
+        <w:spacing w:before="0" w:after="40" w:line="264" w:lineRule="auto"/>
+      </w:pPr>
+    </w:p>
+    <w:p>
+      <w:pPr>
+        <w:pStyle w:val="Heading2"/>
+      </w:pPr>
+      <w:r>
+        <w:rPr>
+          <w:rFonts w:ascii="Calibri" w:hAnsi="Calibri" w:eastAsia="Calibri"/>
+          <w:b/>
+          <w:color w:val="2E74B5"/>
+          <w:sz w:val="26"/>
+        </w:rPr>
+        <w:t>6.5 Dosyayı Açma ve İzinleri Geri Yükleme</w:t>
+      </w:r>
+    </w:p>
+    <w:tbl>
+      <w:tblPr>
+        <w:tblW w:type="auto" w:w="0"/>
+        <w:jc w:val="center"/>
+        <w:tblLayout w:type="fixed"/>
+        <w:tblLook w:firstColumn="1" w:firstRow="1" w:lastColumn="0" w:lastRow="0" w:noHBand="0" w:noVBand="1" w:val="04A0"/>
+        <w:tblBorders>
+          <w:top w:val="single" w:sz="4" w:space="0" w:color="D9E2EC"/>
+          <w:left w:val="single" w:sz="4" w:space="0" w:color="D9E2EC"/>
+          <w:bottom w:val="single" w:sz="4" w:space="0" w:color="D9E2EC"/>
+          <w:right w:val="single" w:sz="4" w:space="0" w:color="D9E2EC"/>
+          <w:insideH w:val="single" w:sz="4" w:space="0" w:color="D9E2EC"/>
+          <w:insideV w:val="single" w:sz="4" w:space="0" w:color="D9E2EC"/>
+        </w:tblBorders>
+        <w:tblCellMar>
+          <w:top w:w="120" w:type="dxa"/>
+          <w:start w:w="150" w:type="dxa"/>
+          <w:bottom w:w="120" w:type="dxa"/>
+          <w:end w:w="150" w:type="dxa"/>
         </w:tblCellMar>
       </w:tblPr>
       <w:tblGrid>
@@ -1985,17 +2319,6 @@
                 <w:sz w:val="17"/>
               </w:rPr>
               <w:t xml:space="preserve">    fprintf(stderr, "Arsiv acilirken hata olustu!\n");</w:t>
-            </w:r>
-            <w:r>
-              <w:br/>
-            </w:r>
-            <w:r>
-              <w:rPr>
-                <w:rFonts w:ascii="Courier New" w:hAnsi="Courier New" w:eastAsia="Courier New"/>
-                <w:b w:val="0"/>
-                <w:sz w:val="17"/>
-              </w:rPr>
-              <w:t xml:space="preserve">    ...</w:t>
             </w:r>
             <w:r>
               <w:br/>
@@ -2050,7 +2373,7 @@
           <w:color w:val="2E74B5"/>
           <w:sz w:val="32"/>
         </w:rPr>
-        <w:t>7. Test Süreci</w:t>
+        <w:t>7. Test Süreci ve Çıktılar</w:t>
       </w:r>
     </w:p>
     <w:p>
@@ -2063,7 +2386,7 @@
           <w:b w:val="0"/>
           <w:sz w:val="22"/>
         </w:rPr>
-        <w:t>Testler önce Makefile üzerindeki standart hedefle, ardından geçici bir çalışma dizininde uçtan uca senaryo matrisiyle yürütülmüştür. Senaryolar başarılı arşivleme/açma akışlarını, varsayılan parametreleri, izin korumayı ve beklenen hata durumlarını kapsar.</w:t>
+        <w:t>Program hem Makefile test hedefiyle hem de manuel komutlarla doğrulanmıştır. Testler; normal arşivleme, varsayılan çıktı adı, format kontrolü, arşiv açma, izin karşılaştırması, ASCII dışı dosya reddi ve bozuk arşiv reddi senaryolarını kapsar.</w:t>
       </w:r>
     </w:p>
     <w:p>
@@ -2077,7 +2400,7 @@
           <w:color w:val="2E74B5"/>
           <w:sz w:val="26"/>
         </w:rPr>
-        <w:t>7.1 make test Çıktısı</w:t>
+        <w:t>7.1 Derleme</w:t>
       </w:r>
     </w:p>
     <w:tbl>
@@ -2095,10 +2418,656 @@
           <w:insideV w:val="single" w:sz="4" w:space="0" w:color="D9E2EC"/>
         </w:tblBorders>
         <w:tblCellMar>
-          <w:top w:w="130" w:type="dxa"/>
-          <w:start w:w="160" w:type="dxa"/>
-          <w:bottom w:w="130" w:type="dxa"/>
-          <w:end w:w="160" w:type="dxa"/>
+          <w:top w:w="120" w:type="dxa"/>
+          <w:start w:w="150" w:type="dxa"/>
+          <w:bottom w:w="120" w:type="dxa"/>
+          <w:end w:w="150" w:type="dxa"/>
+        </w:tblCellMar>
+      </w:tblPr>
+      <w:tblGrid>
+        <w:gridCol w:w="9360"/>
+      </w:tblGrid>
+      <w:tr>
+        <w:tc>
+          <w:tcPr>
+            <w:tcW w:type="dxa" w:w="9072"/>
+            <w:vAlign w:val="center"/>
+            <w:shd w:fill="F4F6F9"/>
+          </w:tcPr>
+          <w:p>
+            <w:pPr>
+              <w:spacing w:after="0" w:line="240" w:lineRule="auto"/>
+            </w:pPr>
+            <w:r>
+              <w:rPr>
+                <w:rFonts w:ascii="Courier New" w:hAnsi="Courier New" w:eastAsia="Courier New"/>
+                <w:b w:val="0"/>
+                <w:sz w:val="17"/>
+              </w:rPr>
+              <w:t>$ make clean &amp;&amp; make</w:t>
+            </w:r>
+            <w:r>
+              <w:br/>
+            </w:r>
+            <w:r>
+              <w:rPr>
+                <w:rFonts w:ascii="Courier New" w:hAnsi="Courier New" w:eastAsia="Courier New"/>
+                <w:b w:val="0"/>
+                <w:sz w:val="17"/>
+              </w:rPr>
+              <w:t>gcc -Wall -Wextra -std=c11 -O2 -o tarsau tarsau.c</w:t>
+            </w:r>
+          </w:p>
+        </w:tc>
+      </w:tr>
+    </w:tbl>
+    <w:p>
+      <w:pPr>
+        <w:spacing w:before="0" w:after="40" w:line="264" w:lineRule="auto"/>
+      </w:pPr>
+    </w:p>
+    <w:p>
+      <w:pPr>
+        <w:pStyle w:val="Heading2"/>
+      </w:pPr>
+      <w:r>
+        <w:rPr>
+          <w:rFonts w:ascii="Calibri" w:hAnsi="Calibri" w:eastAsia="Calibri"/>
+          <w:b/>
+          <w:color w:val="2E74B5"/>
+          <w:sz w:val="26"/>
+        </w:rPr>
+        <w:t>7.2 Örnek Test Dosyaları</w:t>
+      </w:r>
+    </w:p>
+    <w:tbl>
+      <w:tblPr>
+        <w:tblW w:type="auto" w:w="0"/>
+        <w:jc w:val="center"/>
+        <w:tblLayout w:type="fixed"/>
+        <w:tblLook w:firstColumn="1" w:firstRow="1" w:lastColumn="0" w:lastRow="0" w:noHBand="0" w:noVBand="1" w:val="04A0"/>
+        <w:tblBorders>
+          <w:top w:val="single" w:sz="4" w:space="0" w:color="D9E2EC"/>
+          <w:left w:val="single" w:sz="4" w:space="0" w:color="D9E2EC"/>
+          <w:bottom w:val="single" w:sz="4" w:space="0" w:color="D9E2EC"/>
+          <w:right w:val="single" w:sz="4" w:space="0" w:color="D9E2EC"/>
+          <w:insideH w:val="single" w:sz="4" w:space="0" w:color="D9E2EC"/>
+          <w:insideV w:val="single" w:sz="4" w:space="0" w:color="D9E2EC"/>
+        </w:tblBorders>
+        <w:tblCellMar>
+          <w:top w:w="120" w:type="dxa"/>
+          <w:start w:w="150" w:type="dxa"/>
+          <w:bottom w:w="120" w:type="dxa"/>
+          <w:end w:w="150" w:type="dxa"/>
+        </w:tblCellMar>
+      </w:tblPr>
+      <w:tblGrid>
+        <w:gridCol w:w="9360"/>
+      </w:tblGrid>
+      <w:tr>
+        <w:tc>
+          <w:tcPr>
+            <w:tcW w:type="dxa" w:w="9072"/>
+            <w:vAlign w:val="center"/>
+            <w:shd w:fill="F4F6F9"/>
+          </w:tcPr>
+          <w:p>
+            <w:pPr>
+              <w:spacing w:after="0" w:line="240" w:lineRule="auto"/>
+            </w:pPr>
+            <w:r>
+              <w:rPr>
+                <w:rFonts w:ascii="Courier New" w:hAnsi="Courier New" w:eastAsia="Courier New"/>
+                <w:b w:val="0"/>
+                <w:sz w:val="17"/>
+              </w:rPr>
+              <w:t>$ printf 'ilk dosya\n' &gt; t1</w:t>
+            </w:r>
+            <w:r>
+              <w:br/>
+            </w:r>
+            <w:r>
+              <w:rPr>
+                <w:rFonts w:ascii="Courier New" w:hAnsi="Courier New" w:eastAsia="Courier New"/>
+                <w:b w:val="0"/>
+                <w:sz w:val="17"/>
+              </w:rPr>
+              <w:t>$ printf 'ikinci dosya\n' &gt; t2</w:t>
+            </w:r>
+            <w:r>
+              <w:br/>
+            </w:r>
+            <w:r>
+              <w:rPr>
+                <w:rFonts w:ascii="Courier New" w:hAnsi="Courier New" w:eastAsia="Courier New"/>
+                <w:b w:val="0"/>
+                <w:sz w:val="17"/>
+              </w:rPr>
+              <w:t>$ printf 'ucuncu\n' &gt; t3</w:t>
+            </w:r>
+            <w:r>
+              <w:br/>
+            </w:r>
+            <w:r>
+              <w:rPr>
+                <w:rFonts w:ascii="Courier New" w:hAnsi="Courier New" w:eastAsia="Courier New"/>
+                <w:b w:val="0"/>
+                <w:sz w:val="17"/>
+              </w:rPr>
+              <w:t>$ printf 'dorduncu txt\n' &gt; t4.txt</w:t>
+            </w:r>
+            <w:r>
+              <w:br/>
+            </w:r>
+            <w:r>
+              <w:rPr>
+                <w:rFonts w:ascii="Courier New" w:hAnsi="Courier New" w:eastAsia="Courier New"/>
+                <w:b w:val="0"/>
+                <w:sz w:val="17"/>
+              </w:rPr>
+              <w:t>$ printf 'besinci dat\n' &gt; t5.dat</w:t>
+            </w:r>
+          </w:p>
+        </w:tc>
+      </w:tr>
+    </w:tbl>
+    <w:p>
+      <w:pPr>
+        <w:spacing w:before="0" w:after="40" w:line="264" w:lineRule="auto"/>
+      </w:pPr>
+    </w:p>
+    <w:p>
+      <w:pPr>
+        <w:pStyle w:val="Heading2"/>
+      </w:pPr>
+      <w:r>
+        <w:rPr>
+          <w:rFonts w:ascii="Calibri" w:hAnsi="Calibri" w:eastAsia="Calibri"/>
+          <w:b/>
+          <w:color w:val="2E74B5"/>
+          <w:sz w:val="26"/>
+        </w:rPr>
+        <w:t>7.3 Arşiv Formatı Kontrolü</w:t>
+      </w:r>
+    </w:p>
+    <w:tbl>
+      <w:tblPr>
+        <w:tblW w:type="auto" w:w="0"/>
+        <w:jc w:val="center"/>
+        <w:tblLayout w:type="fixed"/>
+        <w:tblLook w:firstColumn="1" w:firstRow="1" w:lastColumn="0" w:lastRow="0" w:noHBand="0" w:noVBand="1" w:val="04A0"/>
+        <w:tblBorders>
+          <w:top w:val="single" w:sz="4" w:space="0" w:color="D9E2EC"/>
+          <w:left w:val="single" w:sz="4" w:space="0" w:color="D9E2EC"/>
+          <w:bottom w:val="single" w:sz="4" w:space="0" w:color="D9E2EC"/>
+          <w:right w:val="single" w:sz="4" w:space="0" w:color="D9E2EC"/>
+          <w:insideH w:val="single" w:sz="4" w:space="0" w:color="D9E2EC"/>
+          <w:insideV w:val="single" w:sz="4" w:space="0" w:color="D9E2EC"/>
+        </w:tblBorders>
+        <w:tblCellMar>
+          <w:top w:w="120" w:type="dxa"/>
+          <w:start w:w="150" w:type="dxa"/>
+          <w:bottom w:w="120" w:type="dxa"/>
+          <w:end w:w="150" w:type="dxa"/>
+        </w:tblCellMar>
+      </w:tblPr>
+      <w:tblGrid>
+        <w:gridCol w:w="9360"/>
+      </w:tblGrid>
+      <w:tr>
+        <w:tc>
+          <w:tcPr>
+            <w:tcW w:type="dxa" w:w="9072"/>
+            <w:vAlign w:val="center"/>
+            <w:shd w:fill="F4F6F9"/>
+          </w:tcPr>
+          <w:p>
+            <w:pPr>
+              <w:spacing w:after="0" w:line="240" w:lineRule="auto"/>
+            </w:pPr>
+            <w:r>
+              <w:rPr>
+                <w:rFonts w:ascii="Courier New" w:hAnsi="Courier New" w:eastAsia="Courier New"/>
+                <w:b w:val="0"/>
+                <w:sz w:val="17"/>
+              </w:rPr>
+              <w:t>$ ./tarsau -b t1 t2 t3 t4.txt t5.dat -o s1.sau</w:t>
+            </w:r>
+            <w:r>
+              <w:br/>
+            </w:r>
+            <w:r>
+              <w:rPr>
+                <w:rFonts w:ascii="Courier New" w:hAnsi="Courier New" w:eastAsia="Courier New"/>
+                <w:b w:val="0"/>
+                <w:sz w:val="17"/>
+              </w:rPr>
+              <w:t>Dosyalar birleştirildi.</w:t>
+            </w:r>
+            <w:r>
+              <w:br/>
+            </w:r>
+            <w:r>
+              <w:rPr>
+                <w:rFonts w:ascii="Courier New" w:hAnsi="Courier New" w:eastAsia="Courier New"/>
+                <w:b w:val="0"/>
+                <w:sz w:val="17"/>
+              </w:rPr>
+            </w:r>
+            <w:r>
+              <w:br/>
+            </w:r>
+            <w:r>
+              <w:rPr>
+                <w:rFonts w:ascii="Courier New" w:hAnsi="Courier New" w:eastAsia="Courier New"/>
+                <w:b w:val="0"/>
+                <w:sz w:val="17"/>
+              </w:rPr>
+              <w:t>$ head -c 100 s1.sau</w:t>
+            </w:r>
+            <w:r>
+              <w:br/>
+            </w:r>
+            <w:r>
+              <w:rPr>
+                <w:rFonts w:ascii="Courier New" w:hAnsi="Courier New" w:eastAsia="Courier New"/>
+                <w:b w:val="0"/>
+                <w:sz w:val="17"/>
+              </w:rPr>
+              <w:t>0000000063|t1,0644,10|t2,0644,13|t3,0644,7|t4.txt,0644,13|t5.dat,0644,12|ilk dosya</w:t>
+            </w:r>
+          </w:p>
+        </w:tc>
+      </w:tr>
+    </w:tbl>
+    <w:p>
+      <w:pPr>
+        <w:spacing w:before="0" w:after="40" w:line="264" w:lineRule="auto"/>
+      </w:pPr>
+    </w:p>
+    <w:p>
+      <w:pPr>
+        <w:pStyle w:val="Heading2"/>
+      </w:pPr>
+      <w:r>
+        <w:rPr>
+          <w:rFonts w:ascii="Calibri" w:hAnsi="Calibri" w:eastAsia="Calibri"/>
+          <w:b/>
+          <w:color w:val="2E74B5"/>
+          <w:sz w:val="26"/>
+        </w:rPr>
+        <w:t>7.4 Arşivden Çıkarma ve İçerik Karşılaştırma</w:t>
+      </w:r>
+    </w:p>
+    <w:tbl>
+      <w:tblPr>
+        <w:tblW w:type="auto" w:w="0"/>
+        <w:jc w:val="center"/>
+        <w:tblLayout w:type="fixed"/>
+        <w:tblLook w:firstColumn="1" w:firstRow="1" w:lastColumn="0" w:lastRow="0" w:noHBand="0" w:noVBand="1" w:val="04A0"/>
+        <w:tblBorders>
+          <w:top w:val="single" w:sz="4" w:space="0" w:color="D9E2EC"/>
+          <w:left w:val="single" w:sz="4" w:space="0" w:color="D9E2EC"/>
+          <w:bottom w:val="single" w:sz="4" w:space="0" w:color="D9E2EC"/>
+          <w:right w:val="single" w:sz="4" w:space="0" w:color="D9E2EC"/>
+          <w:insideH w:val="single" w:sz="4" w:space="0" w:color="D9E2EC"/>
+          <w:insideV w:val="single" w:sz="4" w:space="0" w:color="D9E2EC"/>
+        </w:tblBorders>
+        <w:tblCellMar>
+          <w:top w:w="120" w:type="dxa"/>
+          <w:start w:w="150" w:type="dxa"/>
+          <w:bottom w:w="120" w:type="dxa"/>
+          <w:end w:w="150" w:type="dxa"/>
+        </w:tblCellMar>
+      </w:tblPr>
+      <w:tblGrid>
+        <w:gridCol w:w="9360"/>
+      </w:tblGrid>
+      <w:tr>
+        <w:tc>
+          <w:tcPr>
+            <w:tcW w:type="dxa" w:w="9072"/>
+            <w:vAlign w:val="center"/>
+            <w:shd w:fill="F4F6F9"/>
+          </w:tcPr>
+          <w:p>
+            <w:pPr>
+              <w:spacing w:after="0" w:line="240" w:lineRule="auto"/>
+            </w:pPr>
+            <w:r>
+              <w:rPr>
+                <w:rFonts w:ascii="Courier New" w:hAnsi="Courier New" w:eastAsia="Courier New"/>
+                <w:b w:val="0"/>
+                <w:sz w:val="17"/>
+              </w:rPr>
+              <w:t>$ ./tarsau -a s1.sau d1</w:t>
+            </w:r>
+            <w:r>
+              <w:br/>
+            </w:r>
+            <w:r>
+              <w:rPr>
+                <w:rFonts w:ascii="Courier New" w:hAnsi="Courier New" w:eastAsia="Courier New"/>
+                <w:b w:val="0"/>
+                <w:sz w:val="17"/>
+              </w:rPr>
+              <w:t>d1 dizininde t1, t2, t3, t4.txt ve t5.dat dosyaları açıldı.</w:t>
+            </w:r>
+            <w:r>
+              <w:br/>
+            </w:r>
+            <w:r>
+              <w:rPr>
+                <w:rFonts w:ascii="Courier New" w:hAnsi="Courier New" w:eastAsia="Courier New"/>
+                <w:b w:val="0"/>
+                <w:sz w:val="17"/>
+              </w:rPr>
+            </w:r>
+            <w:r>
+              <w:br/>
+            </w:r>
+            <w:r>
+              <w:rPr>
+                <w:rFonts w:ascii="Courier New" w:hAnsi="Courier New" w:eastAsia="Courier New"/>
+                <w:b w:val="0"/>
+                <w:sz w:val="17"/>
+              </w:rPr>
+              <w:t>$ diff -q t1 d1/t1</w:t>
+            </w:r>
+            <w:r>
+              <w:br/>
+            </w:r>
+            <w:r>
+              <w:rPr>
+                <w:rFonts w:ascii="Courier New" w:hAnsi="Courier New" w:eastAsia="Courier New"/>
+                <w:b w:val="0"/>
+                <w:sz w:val="17"/>
+              </w:rPr>
+              <w:t>$ diff -q t2 d1/t2</w:t>
+            </w:r>
+            <w:r>
+              <w:br/>
+            </w:r>
+            <w:r>
+              <w:rPr>
+                <w:rFonts w:ascii="Courier New" w:hAnsi="Courier New" w:eastAsia="Courier New"/>
+                <w:b w:val="0"/>
+                <w:sz w:val="17"/>
+              </w:rPr>
+              <w:t>$ diff -q t3 d1/t3</w:t>
+            </w:r>
+            <w:r>
+              <w:br/>
+            </w:r>
+            <w:r>
+              <w:rPr>
+                <w:rFonts w:ascii="Courier New" w:hAnsi="Courier New" w:eastAsia="Courier New"/>
+                <w:b w:val="0"/>
+                <w:sz w:val="17"/>
+              </w:rPr>
+              <w:t>$ diff -q t4.txt d1/t4.txt</w:t>
+            </w:r>
+            <w:r>
+              <w:br/>
+            </w:r>
+            <w:r>
+              <w:rPr>
+                <w:rFonts w:ascii="Courier New" w:hAnsi="Courier New" w:eastAsia="Courier New"/>
+                <w:b w:val="0"/>
+                <w:sz w:val="17"/>
+              </w:rPr>
+              <w:t>$ diff -q t5.dat d1/t5.dat</w:t>
+            </w:r>
+          </w:p>
+        </w:tc>
+      </w:tr>
+    </w:tbl>
+    <w:p>
+      <w:pPr>
+        <w:spacing w:before="0" w:after="40" w:line="264" w:lineRule="auto"/>
+      </w:pPr>
+    </w:p>
+    <w:p>
+      <w:pPr>
+        <w:pStyle w:val="Heading2"/>
+      </w:pPr>
+      <w:r>
+        <w:rPr>
+          <w:rFonts w:ascii="Calibri" w:hAnsi="Calibri" w:eastAsia="Calibri"/>
+          <w:b/>
+          <w:color w:val="2E74B5"/>
+          <w:sz w:val="26"/>
+        </w:rPr>
+        <w:t>7.5 İzin ve Boyut Kontrolü</w:t>
+      </w:r>
+    </w:p>
+    <w:tbl>
+      <w:tblPr>
+        <w:tblW w:type="auto" w:w="0"/>
+        <w:jc w:val="center"/>
+        <w:tblLayout w:type="fixed"/>
+        <w:tblLook w:firstColumn="1" w:firstRow="1" w:lastColumn="0" w:lastRow="0" w:noHBand="0" w:noVBand="1" w:val="04A0"/>
+        <w:tblBorders>
+          <w:top w:val="single" w:sz="4" w:space="0" w:color="D9E2EC"/>
+          <w:left w:val="single" w:sz="4" w:space="0" w:color="D9E2EC"/>
+          <w:bottom w:val="single" w:sz="4" w:space="0" w:color="D9E2EC"/>
+          <w:right w:val="single" w:sz="4" w:space="0" w:color="D9E2EC"/>
+          <w:insideH w:val="single" w:sz="4" w:space="0" w:color="D9E2EC"/>
+          <w:insideV w:val="single" w:sz="4" w:space="0" w:color="D9E2EC"/>
+        </w:tblBorders>
+        <w:tblCellMar>
+          <w:top w:w="120" w:type="dxa"/>
+          <w:start w:w="150" w:type="dxa"/>
+          <w:bottom w:w="120" w:type="dxa"/>
+          <w:end w:w="150" w:type="dxa"/>
+        </w:tblCellMar>
+      </w:tblPr>
+      <w:tblGrid>
+        <w:gridCol w:w="9360"/>
+      </w:tblGrid>
+      <w:tr>
+        <w:tc>
+          <w:tcPr>
+            <w:tcW w:type="dxa" w:w="9072"/>
+            <w:vAlign w:val="center"/>
+            <w:shd w:fill="F4F6F9"/>
+          </w:tcPr>
+          <w:p>
+            <w:pPr>
+              <w:spacing w:after="0" w:line="240" w:lineRule="auto"/>
+            </w:pPr>
+            <w:r>
+              <w:rPr>
+                <w:rFonts w:ascii="Courier New" w:hAnsi="Courier New" w:eastAsia="Courier New"/>
+                <w:b w:val="0"/>
+                <w:sz w:val="17"/>
+              </w:rPr>
+              <w:t>$ ls -l t1 d1/t1</w:t>
+            </w:r>
+            <w:r>
+              <w:br/>
+            </w:r>
+            <w:r>
+              <w:rPr>
+                <w:rFonts w:ascii="Courier New" w:hAnsi="Courier New" w:eastAsia="Courier New"/>
+                <w:b w:val="0"/>
+                <w:sz w:val="17"/>
+              </w:rPr>
+              <w:t>-rw-r--r--  1 dogankaya  staff  10 t1</w:t>
+            </w:r>
+            <w:r>
+              <w:br/>
+            </w:r>
+            <w:r>
+              <w:rPr>
+                <w:rFonts w:ascii="Courier New" w:hAnsi="Courier New" w:eastAsia="Courier New"/>
+                <w:b w:val="0"/>
+                <w:sz w:val="17"/>
+              </w:rPr>
+              <w:t>-rw-r--r--  1 dogankaya  staff  10 d1/t1</w:t>
+            </w:r>
+          </w:p>
+        </w:tc>
+      </w:tr>
+    </w:tbl>
+    <w:p>
+      <w:pPr>
+        <w:spacing w:before="0" w:after="40" w:line="264" w:lineRule="auto"/>
+      </w:pPr>
+    </w:p>
+    <w:p>
+      <w:pPr>
+        <w:pStyle w:val="Heading2"/>
+      </w:pPr>
+      <w:r>
+        <w:rPr>
+          <w:rFonts w:ascii="Calibri" w:hAnsi="Calibri" w:eastAsia="Calibri"/>
+          <w:b/>
+          <w:color w:val="2E74B5"/>
+          <w:sz w:val="26"/>
+        </w:rPr>
+        <w:t>7.6 Hata Senaryoları</w:t>
+      </w:r>
+    </w:p>
+    <w:tbl>
+      <w:tblPr>
+        <w:tblW w:type="auto" w:w="0"/>
+        <w:jc w:val="center"/>
+        <w:tblLayout w:type="fixed"/>
+        <w:tblLook w:firstColumn="1" w:firstRow="1" w:lastColumn="0" w:lastRow="0" w:noHBand="0" w:noVBand="1" w:val="04A0"/>
+        <w:tblBorders>
+          <w:top w:val="single" w:sz="4" w:space="0" w:color="D9E2EC"/>
+          <w:left w:val="single" w:sz="4" w:space="0" w:color="D9E2EC"/>
+          <w:bottom w:val="single" w:sz="4" w:space="0" w:color="D9E2EC"/>
+          <w:right w:val="single" w:sz="4" w:space="0" w:color="D9E2EC"/>
+          <w:insideH w:val="single" w:sz="4" w:space="0" w:color="D9E2EC"/>
+          <w:insideV w:val="single" w:sz="4" w:space="0" w:color="D9E2EC"/>
+        </w:tblBorders>
+        <w:tblCellMar>
+          <w:top w:w="120" w:type="dxa"/>
+          <w:start w:w="150" w:type="dxa"/>
+          <w:bottom w:w="120" w:type="dxa"/>
+          <w:end w:w="150" w:type="dxa"/>
+        </w:tblCellMar>
+      </w:tblPr>
+      <w:tblGrid>
+        <w:gridCol w:w="9360"/>
+      </w:tblGrid>
+      <w:tr>
+        <w:tc>
+          <w:tcPr>
+            <w:tcW w:type="dxa" w:w="9072"/>
+            <w:vAlign w:val="center"/>
+            <w:shd w:fill="F4F6F9"/>
+          </w:tcPr>
+          <w:p>
+            <w:pPr>
+              <w:spacing w:after="0" w:line="240" w:lineRule="auto"/>
+            </w:pPr>
+            <w:r>
+              <w:rPr>
+                <w:rFonts w:ascii="Courier New" w:hAnsi="Courier New" w:eastAsia="Courier New"/>
+                <w:b w:val="0"/>
+                <w:sz w:val="17"/>
+              </w:rPr>
+              <w:t>$ cp /bin/ls ./sahte_dosya</w:t>
+            </w:r>
+            <w:r>
+              <w:br/>
+            </w:r>
+            <w:r>
+              <w:rPr>
+                <w:rFonts w:ascii="Courier New" w:hAnsi="Courier New" w:eastAsia="Courier New"/>
+                <w:b w:val="0"/>
+                <w:sz w:val="17"/>
+              </w:rPr>
+              <w:t>$ ./tarsau -b t1 sahte_dosya -o s2.sau</w:t>
+            </w:r>
+            <w:r>
+              <w:br/>
+            </w:r>
+            <w:r>
+              <w:rPr>
+                <w:rFonts w:ascii="Courier New" w:hAnsi="Courier New" w:eastAsia="Courier New"/>
+                <w:b w:val="0"/>
+                <w:sz w:val="17"/>
+              </w:rPr>
+              <w:t>sahte_dosya giriş dosyasının formatı uyumsuzdur!</w:t>
+            </w:r>
+            <w:r>
+              <w:br/>
+            </w:r>
+            <w:r>
+              <w:rPr>
+                <w:rFonts w:ascii="Courier New" w:hAnsi="Courier New" w:eastAsia="Courier New"/>
+                <w:b w:val="0"/>
+                <w:sz w:val="17"/>
+              </w:rPr>
+            </w:r>
+            <w:r>
+              <w:br/>
+            </w:r>
+            <w:r>
+              <w:rPr>
+                <w:rFonts w:ascii="Courier New" w:hAnsi="Courier New" w:eastAsia="Courier New"/>
+                <w:b w:val="0"/>
+                <w:sz w:val="17"/>
+              </w:rPr>
+              <w:t>$ ./tarsau -a t1 d2</w:t>
+            </w:r>
+            <w:r>
+              <w:br/>
+            </w:r>
+            <w:r>
+              <w:rPr>
+                <w:rFonts w:ascii="Courier New" w:hAnsi="Courier New" w:eastAsia="Courier New"/>
+                <w:b w:val="0"/>
+                <w:sz w:val="17"/>
+              </w:rPr>
+              <w:t>Arşiv dosyası uygunsuz veya bozuk!</w:t>
+            </w:r>
+          </w:p>
+        </w:tc>
+      </w:tr>
+    </w:tbl>
+    <w:p>
+      <w:pPr>
+        <w:spacing w:before="0" w:after="40" w:line="264" w:lineRule="auto"/>
+      </w:pPr>
+    </w:p>
+    <w:p>
+      <w:pPr>
+        <w:pStyle w:val="Heading2"/>
+      </w:pPr>
+      <w:r>
+        <w:rPr>
+          <w:rFonts w:ascii="Calibri" w:hAnsi="Calibri" w:eastAsia="Calibri"/>
+          <w:b/>
+          <w:color w:val="2E74B5"/>
+          <w:sz w:val="26"/>
+        </w:rPr>
+        <w:t>7.7 make test Çıktısı</w:t>
+      </w:r>
+    </w:p>
+    <w:tbl>
+      <w:tblPr>
+        <w:tblW w:type="auto" w:w="0"/>
+        <w:jc w:val="center"/>
+        <w:tblLayout w:type="fixed"/>
+        <w:tblLook w:firstColumn="1" w:firstRow="1" w:lastColumn="0" w:lastRow="0" w:noHBand="0" w:noVBand="1" w:val="04A0"/>
+        <w:tblBorders>
+          <w:top w:val="single" w:sz="4" w:space="0" w:color="D9E2EC"/>
+          <w:left w:val="single" w:sz="4" w:space="0" w:color="D9E2EC"/>
+          <w:bottom w:val="single" w:sz="4" w:space="0" w:color="D9E2EC"/>
+          <w:right w:val="single" w:sz="4" w:space="0" w:color="D9E2EC"/>
+          <w:insideH w:val="single" w:sz="4" w:space="0" w:color="D9E2EC"/>
+          <w:insideV w:val="single" w:sz="4" w:space="0" w:color="D9E2EC"/>
+        </w:tblBorders>
+        <w:tblCellMar>
+          <w:top w:w="120" w:type="dxa"/>
+          <w:start w:w="150" w:type="dxa"/>
+          <w:bottom w:w="120" w:type="dxa"/>
+          <w:end w:w="150" w:type="dxa"/>
         </w:tblCellMar>
       </w:tblPr>
       <w:tblGrid>
@@ -2122,17 +3091,6 @@
                 <w:sz w:val="17"/>
               </w:rPr>
               <w:t>$ make test</w:t>
-            </w:r>
-            <w:r>
-              <w:br/>
-            </w:r>
-            <w:r>
-              <w:rPr>
-                <w:rFonts w:ascii="Courier New" w:hAnsi="Courier New" w:eastAsia="Courier New"/>
-                <w:b w:val="0"/>
-                <w:sz w:val="17"/>
-              </w:rPr>
-              <w:t>rm -rf testler/cikti testler/ornek.sau</w:t>
             </w:r>
             <w:r>
               <w:br/>
@@ -2242,20 +3200,6 @@
         <w:spacing w:before="0" w:after="40" w:line="264" w:lineRule="auto"/>
       </w:pPr>
     </w:p>
-    <w:p>
-      <w:pPr>
-        <w:pStyle w:val="Heading2"/>
-      </w:pPr>
-      <w:r>
-        <w:rPr>
-          <w:rFonts w:ascii="Calibri" w:hAnsi="Calibri" w:eastAsia="Calibri"/>
-          <w:b/>
-          <w:color w:val="2E74B5"/>
-          <w:sz w:val="26"/>
-        </w:rPr>
-        <w:t>7.2 Uçtan Uca Test Matrisi</w:t>
-      </w:r>
-    </w:p>
     <w:tbl>
       <w:tblPr>
         <w:tblW w:type="auto" w:w="0"/>
@@ -2272,9 +3216,9 @@
         </w:tblBorders>
         <w:tblCellMar>
           <w:top w:w="75" w:type="dxa"/>
-          <w:start w:w="95" w:type="dxa"/>
+          <w:start w:w="90" w:type="dxa"/>
           <w:bottom w:w="75" w:type="dxa"/>
-          <w:end w:w="95" w:type="dxa"/>
+          <w:end w:w="90" w:type="dxa"/>
         </w:tblCellMar>
       </w:tblPr>
       <w:tblGrid>
@@ -2286,7 +3230,7 @@
       <w:tr>
         <w:tc>
           <w:tcPr>
-            <w:tcW w:type="dxa" w:w="547"/>
+            <w:tcW w:type="dxa" w:w="604"/>
             <w:vAlign w:val="center"/>
             <w:shd w:fill="F2F4F7"/>
           </w:tcPr>
@@ -2299,7 +3243,7 @@
               <w:rPr>
                 <w:rFonts w:ascii="Calibri" w:hAnsi="Calibri" w:eastAsia="Calibri"/>
                 <w:b/>
-                <w:sz w:val="19"/>
+                <w:sz w:val="18"/>
               </w:rPr>
               <w:t>No</w:t>
             </w:r>
@@ -2320,15 +3264,15 @@
               <w:rPr>
                 <w:rFonts w:ascii="Calibri" w:hAnsi="Calibri" w:eastAsia="Calibri"/>
                 <w:b/>
-                <w:sz w:val="19"/>
+                <w:sz w:val="18"/>
               </w:rPr>
-              <w:t>Test senaryosu</w:t>
+              <w:t>Senaryo</w:t>
             </w:r>
           </w:p>
         </w:tc>
         <w:tc>
           <w:tcPr>
-            <w:tcW w:type="dxa" w:w="4464"/>
+            <w:tcW w:type="dxa" w:w="4392"/>
             <w:vAlign w:val="center"/>
             <w:shd w:fill="F2F4F7"/>
           </w:tcPr>
@@ -2341,7 +3285,7 @@
               <w:rPr>
                 <w:rFonts w:ascii="Calibri" w:hAnsi="Calibri" w:eastAsia="Calibri"/>
                 <w:b/>
-                <w:sz w:val="19"/>
+                <w:sz w:val="18"/>
               </w:rPr>
               <w:t>Beklenen sonuç</w:t>
             </w:r>
@@ -2349,7 +3293,7 @@
         </w:tc>
         <w:tc>
           <w:tcPr>
-            <w:tcW w:type="dxa" w:w="964"/>
+            <w:tcW w:type="dxa" w:w="979"/>
             <w:vAlign w:val="center"/>
             <w:shd w:fill="F2F4F7"/>
           </w:tcPr>
@@ -2362,7 +3306,7 @@
               <w:rPr>
                 <w:rFonts w:ascii="Calibri" w:hAnsi="Calibri" w:eastAsia="Calibri"/>
                 <w:b/>
-                <w:sz w:val="19"/>
+                <w:sz w:val="18"/>
               </w:rPr>
               <w:t>Durum</w:t>
             </w:r>
@@ -2403,7 +3347,7 @@
                 <w:b w:val="0"/>
                 <w:sz w:val="17"/>
               </w:rPr>
-              <w:t>5 dosya ile arşiv oluşturma ve ayrı dizine açma</w:t>
+              <w:t>Beş dosyayı s1.sau içine arşivleme</w:t>
             </w:r>
           </w:p>
         </w:tc>
@@ -2421,7 +3365,7 @@
                 <w:b w:val="0"/>
                 <w:sz w:val="17"/>
               </w:rPr>
-              <w:t>Tüm dosyalar diff ile birebir aynı.</w:t>
+              <w:t>Dosyalar birleştirildi mesajı ve .sau dosyası oluşur.</w:t>
             </w:r>
           </w:p>
         </w:tc>
@@ -2480,7 +3424,7 @@
                 <w:b w:val="0"/>
                 <w:sz w:val="17"/>
               </w:rPr>
-              <w:t>-o verilmeden arşiv oluşturma</w:t>
+              <w:t>-o vermeden arşivleme</w:t>
             </w:r>
           </w:p>
         </w:tc>
@@ -2498,7 +3442,7 @@
                 <w:b w:val="0"/>
                 <w:sz w:val="17"/>
               </w:rPr>
-              <w:t>a.sau dosyası oluşur.</w:t>
+              <w:t>a.sau varsayılan adıyla arşiv oluşur.</w:t>
             </w:r>
           </w:p>
         </w:tc>
@@ -2557,7 +3501,7 @@
                 <w:b w:val="0"/>
                 <w:sz w:val="17"/>
               </w:rPr>
-              <w:t>Dizin verilmeden arşiv açma</w:t>
+              <w:t>Header formatını head -c ile kontrol etme</w:t>
             </w:r>
           </w:p>
         </w:tc>
@@ -2575,7 +3519,7 @@
                 <w:b w:val="0"/>
                 <w:sz w:val="17"/>
               </w:rPr>
-              <w:t>Dosya geçerli dizine açılır.</w:t>
+              <w:t>İlk 10 bayt 0000000063 ve metadata tek ayıraçlıdır.</w:t>
             </w:r>
           </w:p>
         </w:tc>
@@ -2634,7 +3578,7 @@
                 <w:b w:val="0"/>
                 <w:sz w:val="17"/>
               </w:rPr>
-              <w:t>Göreceli iç içe dizine açma</w:t>
+              <w:t>Arşivi d1 dizinine açma</w:t>
             </w:r>
           </w:p>
         </w:tc>
@@ -2652,7 +3596,7 @@
                 <w:b w:val="0"/>
                 <w:sz w:val="17"/>
               </w:rPr>
-              <w:t>Hedef dizinler oluşturulur, içerik korunur.</w:t>
+              <w:t>Tüm dosyalar hedef dizine açılır.</w:t>
             </w:r>
           </w:p>
         </w:tc>
@@ -2711,7 +3655,7 @@
                 <w:b w:val="0"/>
                 <w:sz w:val="17"/>
               </w:rPr>
-              <w:t>Mutlak dizine açma</w:t>
+              <w:t>diff ile içerik kontrolü</w:t>
             </w:r>
           </w:p>
         </w:tc>
@@ -2729,7 +3673,7 @@
                 <w:b w:val="0"/>
                 <w:sz w:val="17"/>
               </w:rPr>
-              <w:t>Mutlak hedefte dosya oluşur ve içerik aynıdır.</w:t>
+              <w:t>Kaynak ve açılan dosyalar birebir aynıdır.</w:t>
             </w:r>
           </w:p>
         </w:tc>
@@ -2788,7 +3732,7 @@
                 <w:b w:val="0"/>
                 <w:sz w:val="17"/>
               </w:rPr>
-              <w:t>Çalıştırma izni olan dosyayı arşivleme</w:t>
+              <w:t>ls -l ile izin/boyut kontrolü</w:t>
             </w:r>
           </w:p>
         </w:tc>
@@ -2806,7 +3750,7 @@
                 <w:b w:val="0"/>
                 <w:sz w:val="17"/>
               </w:rPr>
-              <w:t>Açılan dosyanın izni kaynakla aynıdır.</w:t>
+              <w:t>İzinler ve byte boyutları korunur.</w:t>
             </w:r>
           </w:p>
         </w:tc>
@@ -2865,7 +3809,7 @@
                 <w:b w:val="0"/>
                 <w:sz w:val="17"/>
               </w:rPr>
-              <w:t>Türkçe karakter içeren giriş dosyası</w:t>
+              <w:t>Binary dosyayı arşivleme denemesi</w:t>
             </w:r>
           </w:p>
         </w:tc>
@@ -2883,7 +3827,7 @@
                 <w:b w:val="0"/>
                 <w:sz w:val="17"/>
               </w:rPr>
-              <w:t>Uyumsuz format mesajı ile reddedilir.</w:t>
+              <w:t>Uyumsuz format mesajı ile güvenli çıkış yapılır.</w:t>
             </w:r>
           </w:p>
         </w:tc>
@@ -2942,7 +3886,7 @@
                 <w:b w:val="0"/>
                 <w:sz w:val="17"/>
               </w:rPr>
-              <w:t>NUL baytı içeren giriş dosyası</w:t>
+              <w:t>Metin dosyasını arşiv gibi açma</w:t>
             </w:r>
           </w:p>
         </w:tc>
@@ -2960,1085 +3904,7 @@
                 <w:b w:val="0"/>
                 <w:sz w:val="17"/>
               </w:rPr>
-              <w:t>Uyumsuz format mesajı ile reddedilir.</w:t>
-            </w:r>
-          </w:p>
-        </w:tc>
-        <w:tc>
-          <w:tcPr>
-            <w:tcW w:type="dxa" w:w="2340"/>
-            <w:shd w:fill="EAF7EF"/>
-          </w:tcPr>
-          <w:p>
-            <w:pPr>
-              <w:spacing w:after="0" w:line="252" w:lineRule="auto"/>
-              <w:jc w:val="center"/>
-            </w:pPr>
-            <w:r>
-              <w:rPr>
-                <w:rFonts w:ascii="Calibri" w:hAnsi="Calibri" w:eastAsia="Calibri"/>
-                <w:b/>
-                <w:sz w:val="17"/>
-              </w:rPr>
-              <w:t>PASS</w:t>
-            </w:r>
-          </w:p>
-        </w:tc>
-      </w:tr>
-      <w:tr>
-        <w:tc>
-          <w:tcPr>
-            <w:tcW w:type="dxa" w:w="2340"/>
-          </w:tcPr>
-          <w:p>
-            <w:pPr>
-              <w:spacing w:after="0" w:line="252" w:lineRule="auto"/>
-              <w:jc w:val="center"/>
-            </w:pPr>
-            <w:r>
-              <w:rPr>
-                <w:rFonts w:ascii="Calibri" w:hAnsi="Calibri" w:eastAsia="Calibri"/>
-                <w:b w:val="0"/>
-                <w:sz w:val="17"/>
-              </w:rPr>
-              <w:t>9</w:t>
-            </w:r>
-          </w:p>
-        </w:tc>
-        <w:tc>
-          <w:tcPr>
-            <w:tcW w:type="dxa" w:w="2340"/>
-          </w:tcPr>
-          <w:p>
-            <w:pPr>
-              <w:spacing w:after="0" w:line="252" w:lineRule="auto"/>
-            </w:pPr>
-            <w:r>
-              <w:rPr>
-                <w:rFonts w:ascii="Calibri" w:hAnsi="Calibri" w:eastAsia="Calibri"/>
-                <w:b w:val="0"/>
-                <w:sz w:val="17"/>
-              </w:rPr>
-              <w:t>-b sonrası giriş dosyası vermeme</w:t>
-            </w:r>
-          </w:p>
-        </w:tc>
-        <w:tc>
-          <w:tcPr>
-            <w:tcW w:type="dxa" w:w="2340"/>
-          </w:tcPr>
-          <w:p>
-            <w:pPr>
-              <w:spacing w:after="0" w:line="252" w:lineRule="auto"/>
-            </w:pPr>
-            <w:r>
-              <w:rPr>
-                <w:rFonts w:ascii="Calibri" w:hAnsi="Calibri" w:eastAsia="Calibri"/>
-                <w:b w:val="0"/>
-                <w:sz w:val="17"/>
-              </w:rPr>
-              <w:t>Kullanım mesajı ile kontrollü çıkış.</w:t>
-            </w:r>
-          </w:p>
-        </w:tc>
-        <w:tc>
-          <w:tcPr>
-            <w:tcW w:type="dxa" w:w="2340"/>
-            <w:shd w:fill="EAF7EF"/>
-          </w:tcPr>
-          <w:p>
-            <w:pPr>
-              <w:spacing w:after="0" w:line="252" w:lineRule="auto"/>
-              <w:jc w:val="center"/>
-            </w:pPr>
-            <w:r>
-              <w:rPr>
-                <w:rFonts w:ascii="Calibri" w:hAnsi="Calibri" w:eastAsia="Calibri"/>
-                <w:b/>
-                <w:sz w:val="17"/>
-              </w:rPr>
-              <w:t>PASS</w:t>
-            </w:r>
-          </w:p>
-        </w:tc>
-      </w:tr>
-      <w:tr>
-        <w:tc>
-          <w:tcPr>
-            <w:tcW w:type="dxa" w:w="2340"/>
-          </w:tcPr>
-          <w:p>
-            <w:pPr>
-              <w:spacing w:after="0" w:line="252" w:lineRule="auto"/>
-              <w:jc w:val="center"/>
-            </w:pPr>
-            <w:r>
-              <w:rPr>
-                <w:rFonts w:ascii="Calibri" w:hAnsi="Calibri" w:eastAsia="Calibri"/>
-                <w:b w:val="0"/>
-                <w:sz w:val="17"/>
-              </w:rPr>
-              <w:t>10</w:t>
-            </w:r>
-          </w:p>
-        </w:tc>
-        <w:tc>
-          <w:tcPr>
-            <w:tcW w:type="dxa" w:w="2340"/>
-          </w:tcPr>
-          <w:p>
-            <w:pPr>
-              <w:spacing w:after="0" w:line="252" w:lineRule="auto"/>
-            </w:pPr>
-            <w:r>
-              <w:rPr>
-                <w:rFonts w:ascii="Calibri" w:hAnsi="Calibri" w:eastAsia="Calibri"/>
-                <w:b w:val="0"/>
-                <w:sz w:val="17"/>
-              </w:rPr>
-              <w:t>-o sonrası arşiv adı vermeme</w:t>
-            </w:r>
-          </w:p>
-        </w:tc>
-        <w:tc>
-          <w:tcPr>
-            <w:tcW w:type="dxa" w:w="2340"/>
-          </w:tcPr>
-          <w:p>
-            <w:pPr>
-              <w:spacing w:after="0" w:line="252" w:lineRule="auto"/>
-            </w:pPr>
-            <w:r>
-              <w:rPr>
-                <w:rFonts w:ascii="Calibri" w:hAnsi="Calibri" w:eastAsia="Calibri"/>
-                <w:b w:val="0"/>
-                <w:sz w:val="17"/>
-              </w:rPr>
-              <w:t>Kullanım mesajı ile kontrollü çıkış.</w:t>
-            </w:r>
-          </w:p>
-        </w:tc>
-        <w:tc>
-          <w:tcPr>
-            <w:tcW w:type="dxa" w:w="2340"/>
-            <w:shd w:fill="EAF7EF"/>
-          </w:tcPr>
-          <w:p>
-            <w:pPr>
-              <w:spacing w:after="0" w:line="252" w:lineRule="auto"/>
-              <w:jc w:val="center"/>
-            </w:pPr>
-            <w:r>
-              <w:rPr>
-                <w:rFonts w:ascii="Calibri" w:hAnsi="Calibri" w:eastAsia="Calibri"/>
-                <w:b/>
-                <w:sz w:val="17"/>
-              </w:rPr>
-              <w:t>PASS</w:t>
-            </w:r>
-          </w:p>
-        </w:tc>
-      </w:tr>
-      <w:tr>
-        <w:tc>
-          <w:tcPr>
-            <w:tcW w:type="dxa" w:w="2340"/>
-          </w:tcPr>
-          <w:p>
-            <w:pPr>
-              <w:spacing w:after="0" w:line="252" w:lineRule="auto"/>
-              <w:jc w:val="center"/>
-            </w:pPr>
-            <w:r>
-              <w:rPr>
-                <w:rFonts w:ascii="Calibri" w:hAnsi="Calibri" w:eastAsia="Calibri"/>
-                <w:b w:val="0"/>
-                <w:sz w:val="17"/>
-              </w:rPr>
-              <w:t>11</w:t>
-            </w:r>
-          </w:p>
-        </w:tc>
-        <w:tc>
-          <w:tcPr>
-            <w:tcW w:type="dxa" w:w="2340"/>
-          </w:tcPr>
-          <w:p>
-            <w:pPr>
-              <w:spacing w:after="0" w:line="252" w:lineRule="auto"/>
-            </w:pPr>
-            <w:r>
-              <w:rPr>
-                <w:rFonts w:ascii="Calibri" w:hAnsi="Calibri" w:eastAsia="Calibri"/>
-                <w:b w:val="0"/>
-                <w:sz w:val="17"/>
-              </w:rPr>
-              <w:t>Olmayan giriş dosyası</w:t>
-            </w:r>
-          </w:p>
-        </w:tc>
-        <w:tc>
-          <w:tcPr>
-            <w:tcW w:type="dxa" w:w="2340"/>
-          </w:tcPr>
-          <w:p>
-            <w:pPr>
-              <w:spacing w:after="0" w:line="252" w:lineRule="auto"/>
-            </w:pPr>
-            <w:r>
-              <w:rPr>
-                <w:rFonts w:ascii="Calibri" w:hAnsi="Calibri" w:eastAsia="Calibri"/>
-                <w:b w:val="0"/>
-                <w:sz w:val="17"/>
-              </w:rPr>
-              <w:t>Okunamadı hatası ile çıkış.</w:t>
-            </w:r>
-          </w:p>
-        </w:tc>
-        <w:tc>
-          <w:tcPr>
-            <w:tcW w:type="dxa" w:w="2340"/>
-            <w:shd w:fill="EAF7EF"/>
-          </w:tcPr>
-          <w:p>
-            <w:pPr>
-              <w:spacing w:after="0" w:line="252" w:lineRule="auto"/>
-              <w:jc w:val="center"/>
-            </w:pPr>
-            <w:r>
-              <w:rPr>
-                <w:rFonts w:ascii="Calibri" w:hAnsi="Calibri" w:eastAsia="Calibri"/>
-                <w:b/>
-                <w:sz w:val="17"/>
-              </w:rPr>
-              <w:t>PASS</w:t>
-            </w:r>
-          </w:p>
-        </w:tc>
-      </w:tr>
-      <w:tr>
-        <w:tc>
-          <w:tcPr>
-            <w:tcW w:type="dxa" w:w="2340"/>
-          </w:tcPr>
-          <w:p>
-            <w:pPr>
-              <w:spacing w:after="0" w:line="252" w:lineRule="auto"/>
-              <w:jc w:val="center"/>
-            </w:pPr>
-            <w:r>
-              <w:rPr>
-                <w:rFonts w:ascii="Calibri" w:hAnsi="Calibri" w:eastAsia="Calibri"/>
-                <w:b w:val="0"/>
-                <w:sz w:val="17"/>
-              </w:rPr>
-              <w:t>12</w:t>
-            </w:r>
-          </w:p>
-        </w:tc>
-        <w:tc>
-          <w:tcPr>
-            <w:tcW w:type="dxa" w:w="2340"/>
-          </w:tcPr>
-          <w:p>
-            <w:pPr>
-              <w:spacing w:after="0" w:line="252" w:lineRule="auto"/>
-            </w:pPr>
-            <w:r>
-              <w:rPr>
-                <w:rFonts w:ascii="Calibri" w:hAnsi="Calibri" w:eastAsia="Calibri"/>
-                <w:b w:val="0"/>
-                <w:sz w:val="17"/>
-              </w:rPr>
-              <w:t>Aynı basename'e sahip iki dosya</w:t>
-            </w:r>
-          </w:p>
-        </w:tc>
-        <w:tc>
-          <w:tcPr>
-            <w:tcW w:type="dxa" w:w="2340"/>
-          </w:tcPr>
-          <w:p>
-            <w:pPr>
-              <w:spacing w:after="0" w:line="252" w:lineRule="auto"/>
-            </w:pPr>
-            <w:r>
-              <w:rPr>
-                <w:rFonts w:ascii="Calibri" w:hAnsi="Calibri" w:eastAsia="Calibri"/>
-                <w:b w:val="0"/>
-                <w:sz w:val="17"/>
-              </w:rPr>
-              <w:t>Arşiv içi ad tekrarı reddedilir.</w:t>
-            </w:r>
-          </w:p>
-        </w:tc>
-        <w:tc>
-          <w:tcPr>
-            <w:tcW w:type="dxa" w:w="2340"/>
-            <w:shd w:fill="EAF7EF"/>
-          </w:tcPr>
-          <w:p>
-            <w:pPr>
-              <w:spacing w:after="0" w:line="252" w:lineRule="auto"/>
-              <w:jc w:val="center"/>
-            </w:pPr>
-            <w:r>
-              <w:rPr>
-                <w:rFonts w:ascii="Calibri" w:hAnsi="Calibri" w:eastAsia="Calibri"/>
-                <w:b/>
-                <w:sz w:val="17"/>
-              </w:rPr>
-              <w:t>PASS</w:t>
-            </w:r>
-          </w:p>
-        </w:tc>
-      </w:tr>
-      <w:tr>
-        <w:tc>
-          <w:tcPr>
-            <w:tcW w:type="dxa" w:w="2340"/>
-          </w:tcPr>
-          <w:p>
-            <w:pPr>
-              <w:spacing w:after="0" w:line="252" w:lineRule="auto"/>
-              <w:jc w:val="center"/>
-            </w:pPr>
-            <w:r>
-              <w:rPr>
-                <w:rFonts w:ascii="Calibri" w:hAnsi="Calibri" w:eastAsia="Calibri"/>
-                <w:b w:val="0"/>
-                <w:sz w:val="17"/>
-              </w:rPr>
-              <w:t>13</w:t>
-            </w:r>
-          </w:p>
-        </w:tc>
-        <w:tc>
-          <w:tcPr>
-            <w:tcW w:type="dxa" w:w="2340"/>
-          </w:tcPr>
-          <w:p>
-            <w:pPr>
-              <w:spacing w:after="0" w:line="252" w:lineRule="auto"/>
-            </w:pPr>
-            <w:r>
-              <w:rPr>
-                <w:rFonts w:ascii="Calibri" w:hAnsi="Calibri" w:eastAsia="Calibri"/>
-                <w:b w:val="0"/>
-                <w:sz w:val="17"/>
-              </w:rPr>
-              <w:t>Virgül içeren dosya adı</w:t>
-            </w:r>
-          </w:p>
-        </w:tc>
-        <w:tc>
-          <w:tcPr>
-            <w:tcW w:type="dxa" w:w="2340"/>
-          </w:tcPr>
-          <w:p>
-            <w:pPr>
-              <w:spacing w:after="0" w:line="252" w:lineRule="auto"/>
-            </w:pPr>
-            <w:r>
-              <w:rPr>
-                <w:rFonts w:ascii="Calibri" w:hAnsi="Calibri" w:eastAsia="Calibri"/>
-                <w:b w:val="0"/>
-                <w:sz w:val="17"/>
-              </w:rPr>
-              <w:t>Arşiv formatı için uygunsuz ad reddedilir.</w:t>
-            </w:r>
-          </w:p>
-        </w:tc>
-        <w:tc>
-          <w:tcPr>
-            <w:tcW w:type="dxa" w:w="2340"/>
-            <w:shd w:fill="EAF7EF"/>
-          </w:tcPr>
-          <w:p>
-            <w:pPr>
-              <w:spacing w:after="0" w:line="252" w:lineRule="auto"/>
-              <w:jc w:val="center"/>
-            </w:pPr>
-            <w:r>
-              <w:rPr>
-                <w:rFonts w:ascii="Calibri" w:hAnsi="Calibri" w:eastAsia="Calibri"/>
-                <w:b/>
-                <w:sz w:val="17"/>
-              </w:rPr>
-              <w:t>PASS</w:t>
-            </w:r>
-          </w:p>
-        </w:tc>
-      </w:tr>
-      <w:tr>
-        <w:tc>
-          <w:tcPr>
-            <w:tcW w:type="dxa" w:w="2340"/>
-          </w:tcPr>
-          <w:p>
-            <w:pPr>
-              <w:spacing w:after="0" w:line="252" w:lineRule="auto"/>
-              <w:jc w:val="center"/>
-            </w:pPr>
-            <w:r>
-              <w:rPr>
-                <w:rFonts w:ascii="Calibri" w:hAnsi="Calibri" w:eastAsia="Calibri"/>
-                <w:b w:val="0"/>
-                <w:sz w:val="17"/>
-              </w:rPr>
-              <w:t>14</w:t>
-            </w:r>
-          </w:p>
-        </w:tc>
-        <w:tc>
-          <w:tcPr>
-            <w:tcW w:type="dxa" w:w="2340"/>
-          </w:tcPr>
-          <w:p>
-            <w:pPr>
-              <w:spacing w:after="0" w:line="252" w:lineRule="auto"/>
-            </w:pPr>
-            <w:r>
-              <w:rPr>
-                <w:rFonts w:ascii="Calibri" w:hAnsi="Calibri" w:eastAsia="Calibri"/>
-                <w:b w:val="0"/>
-                <w:sz w:val="17"/>
-              </w:rPr>
-              <w:t>33 giriş dosyası</w:t>
-            </w:r>
-          </w:p>
-        </w:tc>
-        <w:tc>
-          <w:tcPr>
-            <w:tcW w:type="dxa" w:w="2340"/>
-          </w:tcPr>
-          <w:p>
-            <w:pPr>
-              <w:spacing w:after="0" w:line="252" w:lineRule="auto"/>
-            </w:pPr>
-            <w:r>
-              <w:rPr>
-                <w:rFonts w:ascii="Calibri" w:hAnsi="Calibri" w:eastAsia="Calibri"/>
-                <w:b w:val="0"/>
-                <w:sz w:val="17"/>
-              </w:rPr>
-              <w:t>En fazla 32 dosya sınırı uygulanır.</w:t>
-            </w:r>
-          </w:p>
-        </w:tc>
-        <w:tc>
-          <w:tcPr>
-            <w:tcW w:type="dxa" w:w="2340"/>
-            <w:shd w:fill="EAF7EF"/>
-          </w:tcPr>
-          <w:p>
-            <w:pPr>
-              <w:spacing w:after="0" w:line="252" w:lineRule="auto"/>
-              <w:jc w:val="center"/>
-            </w:pPr>
-            <w:r>
-              <w:rPr>
-                <w:rFonts w:ascii="Calibri" w:hAnsi="Calibri" w:eastAsia="Calibri"/>
-                <w:b/>
-                <w:sz w:val="17"/>
-              </w:rPr>
-              <w:t>PASS</w:t>
-            </w:r>
-          </w:p>
-        </w:tc>
-      </w:tr>
-      <w:tr>
-        <w:tc>
-          <w:tcPr>
-            <w:tcW w:type="dxa" w:w="2340"/>
-          </w:tcPr>
-          <w:p>
-            <w:pPr>
-              <w:spacing w:after="0" w:line="252" w:lineRule="auto"/>
-              <w:jc w:val="center"/>
-            </w:pPr>
-            <w:r>
-              <w:rPr>
-                <w:rFonts w:ascii="Calibri" w:hAnsi="Calibri" w:eastAsia="Calibri"/>
-                <w:b w:val="0"/>
-                <w:sz w:val="17"/>
-              </w:rPr>
-              <w:t>15</w:t>
-            </w:r>
-          </w:p>
-        </w:tc>
-        <w:tc>
-          <w:tcPr>
-            <w:tcW w:type="dxa" w:w="2340"/>
-          </w:tcPr>
-          <w:p>
-            <w:pPr>
-              <w:spacing w:after="0" w:line="252" w:lineRule="auto"/>
-            </w:pPr>
-            <w:r>
-              <w:rPr>
-                <w:rFonts w:ascii="Calibri" w:hAnsi="Calibri" w:eastAsia="Calibri"/>
-                <w:b w:val="0"/>
-                <w:sz w:val="17"/>
-              </w:rPr>
-              <w:t>.sau olmayan dosyayı açma</w:t>
-            </w:r>
-          </w:p>
-        </w:tc>
-        <w:tc>
-          <w:tcPr>
-            <w:tcW w:type="dxa" w:w="2340"/>
-          </w:tcPr>
-          <w:p>
-            <w:pPr>
-              <w:spacing w:after="0" w:line="252" w:lineRule="auto"/>
-            </w:pPr>
-            <w:r>
-              <w:rPr>
-                <w:rFonts w:ascii="Calibri" w:hAnsi="Calibri" w:eastAsia="Calibri"/>
-                <w:b w:val="0"/>
-                <w:sz w:val="17"/>
-              </w:rPr>
-              <w:t>Arşiv dosyası uygunsuz veya bozuk mesajı.</w:t>
-            </w:r>
-          </w:p>
-        </w:tc>
-        <w:tc>
-          <w:tcPr>
-            <w:tcW w:type="dxa" w:w="2340"/>
-            <w:shd w:fill="EAF7EF"/>
-          </w:tcPr>
-          <w:p>
-            <w:pPr>
-              <w:spacing w:after="0" w:line="252" w:lineRule="auto"/>
-              <w:jc w:val="center"/>
-            </w:pPr>
-            <w:r>
-              <w:rPr>
-                <w:rFonts w:ascii="Calibri" w:hAnsi="Calibri" w:eastAsia="Calibri"/>
-                <w:b/>
-                <w:sz w:val="17"/>
-              </w:rPr>
-              <w:t>PASS</w:t>
-            </w:r>
-          </w:p>
-        </w:tc>
-      </w:tr>
-      <w:tr>
-        <w:tc>
-          <w:tcPr>
-            <w:tcW w:type="dxa" w:w="2340"/>
-          </w:tcPr>
-          <w:p>
-            <w:pPr>
-              <w:spacing w:after="0" w:line="252" w:lineRule="auto"/>
-              <w:jc w:val="center"/>
-            </w:pPr>
-            <w:r>
-              <w:rPr>
-                <w:rFonts w:ascii="Calibri" w:hAnsi="Calibri" w:eastAsia="Calibri"/>
-                <w:b w:val="0"/>
-                <w:sz w:val="17"/>
-              </w:rPr>
-              <w:t>16</w:t>
-            </w:r>
-          </w:p>
-        </w:tc>
-        <w:tc>
-          <w:tcPr>
-            <w:tcW w:type="dxa" w:w="2340"/>
-          </w:tcPr>
-          <w:p>
-            <w:pPr>
-              <w:spacing w:after="0" w:line="252" w:lineRule="auto"/>
-            </w:pPr>
-            <w:r>
-              <w:rPr>
-                <w:rFonts w:ascii="Calibri" w:hAnsi="Calibri" w:eastAsia="Calibri"/>
-                <w:b w:val="0"/>
-                <w:sz w:val="17"/>
-              </w:rPr>
-              <w:t>Olmayan .sau dosyasını açma</w:t>
-            </w:r>
-          </w:p>
-        </w:tc>
-        <w:tc>
-          <w:tcPr>
-            <w:tcW w:type="dxa" w:w="2340"/>
-          </w:tcPr>
-          <w:p>
-            <w:pPr>
-              <w:spacing w:after="0" w:line="252" w:lineRule="auto"/>
-            </w:pPr>
-            <w:r>
-              <w:rPr>
-                <w:rFonts w:ascii="Calibri" w:hAnsi="Calibri" w:eastAsia="Calibri"/>
-                <w:b w:val="0"/>
-                <w:sz w:val="17"/>
-              </w:rPr>
-              <w:t>Arşiv dosyası uygunsuz veya bozuk mesajı.</w:t>
-            </w:r>
-          </w:p>
-        </w:tc>
-        <w:tc>
-          <w:tcPr>
-            <w:tcW w:type="dxa" w:w="2340"/>
-            <w:shd w:fill="EAF7EF"/>
-          </w:tcPr>
-          <w:p>
-            <w:pPr>
-              <w:spacing w:after="0" w:line="252" w:lineRule="auto"/>
-              <w:jc w:val="center"/>
-            </w:pPr>
-            <w:r>
-              <w:rPr>
-                <w:rFonts w:ascii="Calibri" w:hAnsi="Calibri" w:eastAsia="Calibri"/>
-                <w:b/>
-                <w:sz w:val="17"/>
-              </w:rPr>
-              <w:t>PASS</w:t>
-            </w:r>
-          </w:p>
-        </w:tc>
-      </w:tr>
-      <w:tr>
-        <w:tc>
-          <w:tcPr>
-            <w:tcW w:type="dxa" w:w="2340"/>
-          </w:tcPr>
-          <w:p>
-            <w:pPr>
-              <w:spacing w:after="0" w:line="252" w:lineRule="auto"/>
-              <w:jc w:val="center"/>
-            </w:pPr>
-            <w:r>
-              <w:rPr>
-                <w:rFonts w:ascii="Calibri" w:hAnsi="Calibri" w:eastAsia="Calibri"/>
-                <w:b w:val="0"/>
-                <w:sz w:val="17"/>
-              </w:rPr>
-              <w:t>17</w:t>
-            </w:r>
-          </w:p>
-        </w:tc>
-        <w:tc>
-          <w:tcPr>
-            <w:tcW w:type="dxa" w:w="2340"/>
-          </w:tcPr>
-          <w:p>
-            <w:pPr>
-              <w:spacing w:after="0" w:line="252" w:lineRule="auto"/>
-            </w:pPr>
-            <w:r>
-              <w:rPr>
-                <w:rFonts w:ascii="Calibri" w:hAnsi="Calibri" w:eastAsia="Calibri"/>
-                <w:b w:val="0"/>
-                <w:sz w:val="17"/>
-              </w:rPr>
-              <w:t>-a için fazla parametre verme</w:t>
-            </w:r>
-          </w:p>
-        </w:tc>
-        <w:tc>
-          <w:tcPr>
-            <w:tcW w:type="dxa" w:w="2340"/>
-          </w:tcPr>
-          <w:p>
-            <w:pPr>
-              <w:spacing w:after="0" w:line="252" w:lineRule="auto"/>
-            </w:pPr>
-            <w:r>
-              <w:rPr>
-                <w:rFonts w:ascii="Calibri" w:hAnsi="Calibri" w:eastAsia="Calibri"/>
-                <w:b w:val="0"/>
-                <w:sz w:val="17"/>
-              </w:rPr>
-              <w:t>Arşiv dosyası uygunsuz veya bozuk mesajı.</w:t>
-            </w:r>
-          </w:p>
-        </w:tc>
-        <w:tc>
-          <w:tcPr>
-            <w:tcW w:type="dxa" w:w="2340"/>
-            <w:shd w:fill="EAF7EF"/>
-          </w:tcPr>
-          <w:p>
-            <w:pPr>
-              <w:spacing w:after="0" w:line="252" w:lineRule="auto"/>
-              <w:jc w:val="center"/>
-            </w:pPr>
-            <w:r>
-              <w:rPr>
-                <w:rFonts w:ascii="Calibri" w:hAnsi="Calibri" w:eastAsia="Calibri"/>
-                <w:b/>
-                <w:sz w:val="17"/>
-              </w:rPr>
-              <w:t>PASS</w:t>
-            </w:r>
-          </w:p>
-        </w:tc>
-      </w:tr>
-      <w:tr>
-        <w:tc>
-          <w:tcPr>
-            <w:tcW w:type="dxa" w:w="2340"/>
-          </w:tcPr>
-          <w:p>
-            <w:pPr>
-              <w:spacing w:after="0" w:line="252" w:lineRule="auto"/>
-              <w:jc w:val="center"/>
-            </w:pPr>
-            <w:r>
-              <w:rPr>
-                <w:rFonts w:ascii="Calibri" w:hAnsi="Calibri" w:eastAsia="Calibri"/>
-                <w:b w:val="0"/>
-                <w:sz w:val="17"/>
-              </w:rPr>
-              <w:t>18</w:t>
-            </w:r>
-          </w:p>
-        </w:tc>
-        <w:tc>
-          <w:tcPr>
-            <w:tcW w:type="dxa" w:w="2340"/>
-          </w:tcPr>
-          <w:p>
-            <w:pPr>
-              <w:spacing w:after="0" w:line="252" w:lineRule="auto"/>
-            </w:pPr>
-            <w:r>
-              <w:rPr>
-                <w:rFonts w:ascii="Calibri" w:hAnsi="Calibri" w:eastAsia="Calibri"/>
-                <w:b w:val="0"/>
-                <w:sz w:val="17"/>
-              </w:rPr>
-              <w:t>Sayısal olmayan başlıklı bozuk arşiv</w:t>
-            </w:r>
-          </w:p>
-        </w:tc>
-        <w:tc>
-          <w:tcPr>
-            <w:tcW w:type="dxa" w:w="2340"/>
-          </w:tcPr>
-          <w:p>
-            <w:pPr>
-              <w:spacing w:after="0" w:line="252" w:lineRule="auto"/>
-            </w:pPr>
-            <w:r>
-              <w:rPr>
-                <w:rFonts w:ascii="Calibri" w:hAnsi="Calibri" w:eastAsia="Calibri"/>
-                <w:b w:val="0"/>
-                <w:sz w:val="17"/>
-              </w:rPr>
-              <w:t>Bozuk arşiv olarak reddedilir.</w:t>
-            </w:r>
-          </w:p>
-        </w:tc>
-        <w:tc>
-          <w:tcPr>
-            <w:tcW w:type="dxa" w:w="2340"/>
-            <w:shd w:fill="EAF7EF"/>
-          </w:tcPr>
-          <w:p>
-            <w:pPr>
-              <w:spacing w:after="0" w:line="252" w:lineRule="auto"/>
-              <w:jc w:val="center"/>
-            </w:pPr>
-            <w:r>
-              <w:rPr>
-                <w:rFonts w:ascii="Calibri" w:hAnsi="Calibri" w:eastAsia="Calibri"/>
-                <w:b/>
-                <w:sz w:val="17"/>
-              </w:rPr>
-              <w:t>PASS</w:t>
-            </w:r>
-          </w:p>
-        </w:tc>
-      </w:tr>
-      <w:tr>
-        <w:tc>
-          <w:tcPr>
-            <w:tcW w:type="dxa" w:w="2340"/>
-          </w:tcPr>
-          <w:p>
-            <w:pPr>
-              <w:spacing w:after="0" w:line="252" w:lineRule="auto"/>
-              <w:jc w:val="center"/>
-            </w:pPr>
-            <w:r>
-              <w:rPr>
-                <w:rFonts w:ascii="Calibri" w:hAnsi="Calibri" w:eastAsia="Calibri"/>
-                <w:b w:val="0"/>
-                <w:sz w:val="17"/>
-              </w:rPr>
-              <w:t>19</w:t>
-            </w:r>
-          </w:p>
-        </w:tc>
-        <w:tc>
-          <w:tcPr>
-            <w:tcW w:type="dxa" w:w="2340"/>
-          </w:tcPr>
-          <w:p>
-            <w:pPr>
-              <w:spacing w:after="0" w:line="252" w:lineRule="auto"/>
-            </w:pPr>
-            <w:r>
-              <w:rPr>
-                <w:rFonts w:ascii="Calibri" w:hAnsi="Calibri" w:eastAsia="Calibri"/>
-                <w:b w:val="0"/>
-                <w:sz w:val="17"/>
-              </w:rPr>
-              <w:t>10 bayttan kısa arşiv</w:t>
-            </w:r>
-          </w:p>
-        </w:tc>
-        <w:tc>
-          <w:tcPr>
-            <w:tcW w:type="dxa" w:w="2340"/>
-          </w:tcPr>
-          <w:p>
-            <w:pPr>
-              <w:spacing w:after="0" w:line="252" w:lineRule="auto"/>
-            </w:pPr>
-            <w:r>
-              <w:rPr>
-                <w:rFonts w:ascii="Calibri" w:hAnsi="Calibri" w:eastAsia="Calibri"/>
-                <w:b w:val="0"/>
-                <w:sz w:val="17"/>
-              </w:rPr>
-              <w:t>Bozuk arşiv olarak reddedilir.</w:t>
-            </w:r>
-          </w:p>
-        </w:tc>
-        <w:tc>
-          <w:tcPr>
-            <w:tcW w:type="dxa" w:w="2340"/>
-            <w:shd w:fill="EAF7EF"/>
-          </w:tcPr>
-          <w:p>
-            <w:pPr>
-              <w:spacing w:after="0" w:line="252" w:lineRule="auto"/>
-              <w:jc w:val="center"/>
-            </w:pPr>
-            <w:r>
-              <w:rPr>
-                <w:rFonts w:ascii="Calibri" w:hAnsi="Calibri" w:eastAsia="Calibri"/>
-                <w:b/>
-                <w:sz w:val="17"/>
-              </w:rPr>
-              <w:t>PASS</w:t>
-            </w:r>
-          </w:p>
-        </w:tc>
-      </w:tr>
-      <w:tr>
-        <w:tc>
-          <w:tcPr>
-            <w:tcW w:type="dxa" w:w="2340"/>
-          </w:tcPr>
-          <w:p>
-            <w:pPr>
-              <w:spacing w:after="0" w:line="252" w:lineRule="auto"/>
-              <w:jc w:val="center"/>
-            </w:pPr>
-            <w:r>
-              <w:rPr>
-                <w:rFonts w:ascii="Calibri" w:hAnsi="Calibri" w:eastAsia="Calibri"/>
-                <w:b w:val="0"/>
-                <w:sz w:val="17"/>
-              </w:rPr>
-              <w:t>20</w:t>
-            </w:r>
-          </w:p>
-        </w:tc>
-        <w:tc>
-          <w:tcPr>
-            <w:tcW w:type="dxa" w:w="2340"/>
-          </w:tcPr>
-          <w:p>
-            <w:pPr>
-              <w:spacing w:after="0" w:line="252" w:lineRule="auto"/>
-            </w:pPr>
-            <w:r>
-              <w:rPr>
-                <w:rFonts w:ascii="Calibri" w:hAnsi="Calibri" w:eastAsia="Calibri"/>
-                <w:b w:val="0"/>
-                <w:sz w:val="17"/>
-              </w:rPr>
-              <w:t>Eksik metadata kaydı</w:t>
-            </w:r>
-          </w:p>
-        </w:tc>
-        <w:tc>
-          <w:tcPr>
-            <w:tcW w:type="dxa" w:w="2340"/>
-          </w:tcPr>
-          <w:p>
-            <w:pPr>
-              <w:spacing w:after="0" w:line="252" w:lineRule="auto"/>
-            </w:pPr>
-            <w:r>
-              <w:rPr>
-                <w:rFonts w:ascii="Calibri" w:hAnsi="Calibri" w:eastAsia="Calibri"/>
-                <w:b w:val="0"/>
-                <w:sz w:val="17"/>
-              </w:rPr>
-              <w:t>Bozuk arşiv olarak reddedilir.</w:t>
-            </w:r>
-          </w:p>
-        </w:tc>
-        <w:tc>
-          <w:tcPr>
-            <w:tcW w:type="dxa" w:w="2340"/>
-            <w:shd w:fill="EAF7EF"/>
-          </w:tcPr>
-          <w:p>
-            <w:pPr>
-              <w:spacing w:after="0" w:line="252" w:lineRule="auto"/>
-              <w:jc w:val="center"/>
-            </w:pPr>
-            <w:r>
-              <w:rPr>
-                <w:rFonts w:ascii="Calibri" w:hAnsi="Calibri" w:eastAsia="Calibri"/>
-                <w:b/>
-                <w:sz w:val="17"/>
-              </w:rPr>
-              <w:t>PASS</w:t>
-            </w:r>
-          </w:p>
-        </w:tc>
-      </w:tr>
-      <w:tr>
-        <w:tc>
-          <w:tcPr>
-            <w:tcW w:type="dxa" w:w="2340"/>
-          </w:tcPr>
-          <w:p>
-            <w:pPr>
-              <w:spacing w:after="0" w:line="252" w:lineRule="auto"/>
-              <w:jc w:val="center"/>
-            </w:pPr>
-            <w:r>
-              <w:rPr>
-                <w:rFonts w:ascii="Calibri" w:hAnsi="Calibri" w:eastAsia="Calibri"/>
-                <w:b w:val="0"/>
-                <w:sz w:val="17"/>
-              </w:rPr>
-              <w:t>21</w:t>
-            </w:r>
-          </w:p>
-        </w:tc>
-        <w:tc>
-          <w:tcPr>
-            <w:tcW w:type="dxa" w:w="2340"/>
-          </w:tcPr>
-          <w:p>
-            <w:pPr>
-              <w:spacing w:after="0" w:line="252" w:lineRule="auto"/>
-            </w:pPr>
-            <w:r>
-              <w:rPr>
-                <w:rFonts w:ascii="Calibri" w:hAnsi="Calibri" w:eastAsia="Calibri"/>
-                <w:b w:val="0"/>
-                <w:sz w:val="17"/>
-              </w:rPr>
-              <w:t>Payload boyutu metadata ile uyuşmayan arşiv</w:t>
-            </w:r>
-          </w:p>
-        </w:tc>
-        <w:tc>
-          <w:tcPr>
-            <w:tcW w:type="dxa" w:w="2340"/>
-          </w:tcPr>
-          <w:p>
-            <w:pPr>
-              <w:spacing w:after="0" w:line="252" w:lineRule="auto"/>
-            </w:pPr>
-            <w:r>
-              <w:rPr>
-                <w:rFonts w:ascii="Calibri" w:hAnsi="Calibri" w:eastAsia="Calibri"/>
-                <w:b w:val="0"/>
-                <w:sz w:val="17"/>
-              </w:rPr>
-              <w:t>Bozuk arşiv olarak reddedilir.</w:t>
-            </w:r>
-          </w:p>
-        </w:tc>
-        <w:tc>
-          <w:tcPr>
-            <w:tcW w:type="dxa" w:w="2340"/>
-            <w:shd w:fill="EAF7EF"/>
-          </w:tcPr>
-          <w:p>
-            <w:pPr>
-              <w:spacing w:after="0" w:line="252" w:lineRule="auto"/>
-              <w:jc w:val="center"/>
-            </w:pPr>
-            <w:r>
-              <w:rPr>
-                <w:rFonts w:ascii="Calibri" w:hAnsi="Calibri" w:eastAsia="Calibri"/>
-                <w:b/>
-                <w:sz w:val="17"/>
-              </w:rPr>
-              <w:t>PASS</w:t>
-            </w:r>
-          </w:p>
-        </w:tc>
-      </w:tr>
-      <w:tr>
-        <w:tc>
-          <w:tcPr>
-            <w:tcW w:type="dxa" w:w="2340"/>
-          </w:tcPr>
-          <w:p>
-            <w:pPr>
-              <w:spacing w:after="0" w:line="252" w:lineRule="auto"/>
-              <w:jc w:val="center"/>
-            </w:pPr>
-            <w:r>
-              <w:rPr>
-                <w:rFonts w:ascii="Calibri" w:hAnsi="Calibri" w:eastAsia="Calibri"/>
-                <w:b w:val="0"/>
-                <w:sz w:val="17"/>
-              </w:rPr>
-              <w:t>22</w:t>
-            </w:r>
-          </w:p>
-        </w:tc>
-        <w:tc>
-          <w:tcPr>
-            <w:tcW w:type="dxa" w:w="2340"/>
-          </w:tcPr>
-          <w:p>
-            <w:pPr>
-              <w:spacing w:after="0" w:line="252" w:lineRule="auto"/>
-            </w:pPr>
-            <w:r>
-              <w:rPr>
-                <w:rFonts w:ascii="Calibri" w:hAnsi="Calibri" w:eastAsia="Calibri"/>
-                <w:b w:val="0"/>
-                <w:sz w:val="17"/>
-              </w:rPr>
-              <w:t>Toplam 200 MB üzeri ASCII giriş</w:t>
-            </w:r>
-          </w:p>
-        </w:tc>
-        <w:tc>
-          <w:tcPr>
-            <w:tcW w:type="dxa" w:w="2340"/>
-          </w:tcPr>
-          <w:p>
-            <w:pPr>
-              <w:spacing w:after="0" w:line="252" w:lineRule="auto"/>
-            </w:pPr>
-            <w:r>
-              <w:rPr>
-                <w:rFonts w:ascii="Calibri" w:hAnsi="Calibri" w:eastAsia="Calibri"/>
-                <w:b w:val="0"/>
-                <w:sz w:val="17"/>
-              </w:rPr>
-              <w:t>200 MB sınırı mesajıyla reddedilir.</w:t>
+              <w:t>Arşiv dosyası uygunsuz veya bozuk mesajı verilir.</w:t>
             </w:r>
           </w:p>
         </w:tc>
@@ -4071,20 +3937,6 @@
     </w:p>
     <w:p>
       <w:pPr>
-        <w:spacing w:before="0" w:after="120" w:line="264" w:lineRule="auto"/>
-      </w:pPr>
-      <w:r>
-        <w:rPr>
-          <w:rFonts w:ascii="Calibri" w:hAnsi="Calibri" w:eastAsia="Calibri"/>
-          <w:b/>
-          <w:color w:val="0B2545"/>
-          <w:sz w:val="22"/>
-        </w:rPr>
-        <w:t>Toplam sonuç: 22 senaryo çalıştırıldı, 22 başarılı, 0 başarısız.</w:t>
-      </w:r>
-    </w:p>
-    <w:p>
-      <w:pPr>
         <w:pStyle w:val="Heading1"/>
       </w:pPr>
       <w:r>
@@ -4112,10 +3964,10 @@
           <w:insideV w:val="single" w:sz="4" w:space="0" w:color="D9E2EC"/>
         </w:tblBorders>
         <w:tblCellMar>
-          <w:top w:w="130" w:type="dxa"/>
-          <w:start w:w="160" w:type="dxa"/>
-          <w:bottom w:w="130" w:type="dxa"/>
-          <w:end w:w="160" w:type="dxa"/>
+          <w:top w:w="120" w:type="dxa"/>
+          <w:start w:w="150" w:type="dxa"/>
+          <w:bottom w:w="120" w:type="dxa"/>
+          <w:end w:w="150" w:type="dxa"/>
         </w:tblCellMar>
       </w:tblPr>
       <w:tblGrid>
@@ -4150,17 +4002,6 @@
                 <w:sz w:val="17"/>
               </w:rPr>
               <w:t xml:space="preserve">  Makefile</w:t>
-            </w:r>
-            <w:r>
-              <w:br/>
-            </w:r>
-            <w:r>
-              <w:rPr>
-                <w:rFonts w:ascii="Courier New" w:hAnsi="Courier New" w:eastAsia="Courier New"/>
-                <w:b w:val="0"/>
-                <w:sz w:val="17"/>
-              </w:rPr>
-              <w:t xml:space="preserve">  README.md</w:t>
             </w:r>
             <w:r>
               <w:br/>
@@ -4294,7 +4135,7 @@
           <w:b w:val="0"/>
           <w:sz w:val="22"/>
         </w:rPr>
-        <w:t>tarsau programı, proje föyünde tanımlanan sıkıştırmasız arşivleme davranışını C diliyle gerçekleştirmektedir. Başarılı akışlarda dosya içerikleri ve izinleri korunmuş, hata akışlarında program çökmeden anlamlı hata mesajlarıyla sonlanmıştır. Derleme, standart make test hedefi ve 22 uçtan uca test senaryosu başarıyla tamamlanmıştır.</w:t>
+        <w:t>Geliştirilen tarsau programı, proje föyünde tanımlanan sıkıştırmasız arşivleme gereksinimlerini karşılamaktadır. Son düzeltmeyle .sau formatında çift ayıraç oluşması engellenmiş ve ilk 10 baytlık uzunluk alanı yalnızca metadata uzunluğunu gösterecek şekilde düzenlenmiştir. Derleme, format kontrolü, arşiv açma, içerik karşılaştırma, izin koruma ve hata yönetimi testleri başarıyla tamamlanmıştır.</w:t>
       </w:r>
     </w:p>
     <w:p>
@@ -4320,12 +4161,13 @@
           <w:color w:val="2E74B5"/>
           <w:sz w:val="32"/>
         </w:rPr>
-        <w:t>Ek A - Test Komut Özeti</w:t>
+        <w:t>Ek A - Teslim Notları</w:t>
       </w:r>
     </w:p>
     <w:p>
       <w:pPr>
-        <w:spacing w:before="0" w:after="120" w:line="264" w:lineRule="auto"/>
+        <w:pStyle w:val="ListBullet"/>
+        <w:spacing w:after="100" w:line="280" w:lineRule="auto"/>
       </w:pPr>
       <w:r>
         <w:rPr>
@@ -4333,135 +4175,36 @@
           <w:b w:val="0"/>
           <w:sz w:val="22"/>
         </w:rPr>
-        <w:t>Testler 19 Mayıs 2026 tarihinde yerel çalışma alanında, macOS üzerinde gcc ve make kullanılarak yürütülmüştür.</w:t>
+        <w:t>Öğrenci numaraları bu raporda ayrı alan olarak ayrılmıştır; numaralar teslim öncesinde girilmelidir.</w:t>
       </w:r>
     </w:p>
-    <w:tbl>
-      <w:tblPr>
-        <w:tblW w:type="auto" w:w="0"/>
-        <w:jc w:val="center"/>
-        <w:tblLayout w:type="fixed"/>
-        <w:tblLook w:firstColumn="1" w:firstRow="1" w:lastColumn="0" w:lastRow="0" w:noHBand="0" w:noVBand="1" w:val="04A0"/>
-        <w:tblBorders>
-          <w:top w:val="single" w:sz="4" w:space="0" w:color="D9E2EC"/>
-          <w:left w:val="single" w:sz="4" w:space="0" w:color="D9E2EC"/>
-          <w:bottom w:val="single" w:sz="4" w:space="0" w:color="D9E2EC"/>
-          <w:right w:val="single" w:sz="4" w:space="0" w:color="D9E2EC"/>
-          <w:insideH w:val="single" w:sz="4" w:space="0" w:color="D9E2EC"/>
-          <w:insideV w:val="single" w:sz="4" w:space="0" w:color="D9E2EC"/>
-        </w:tblBorders>
-        <w:tblCellMar>
-          <w:top w:w="130" w:type="dxa"/>
-          <w:start w:w="160" w:type="dxa"/>
-          <w:bottom w:w="130" w:type="dxa"/>
-          <w:end w:w="160" w:type="dxa"/>
-        </w:tblCellMar>
-      </w:tblPr>
-      <w:tblGrid>
-        <w:gridCol w:w="9360"/>
-      </w:tblGrid>
-      <w:tr>
-        <w:tc>
-          <w:tcPr>
-            <w:tcW w:type="dxa" w:w="9072"/>
-            <w:vAlign w:val="center"/>
-            <w:shd w:fill="F4F6F9"/>
-          </w:tcPr>
-          <w:p>
-            <w:pPr>
-              <w:spacing w:after="0" w:line="240" w:lineRule="auto"/>
-            </w:pPr>
-            <w:r>
-              <w:rPr>
-                <w:rFonts w:ascii="Courier New" w:hAnsi="Courier New" w:eastAsia="Courier New"/>
-                <w:b w:val="0"/>
-                <w:sz w:val="17"/>
-              </w:rPr>
-              <w:t>$ make clean &amp;&amp; make</w:t>
-            </w:r>
-            <w:r>
-              <w:br/>
-            </w:r>
-            <w:r>
-              <w:rPr>
-                <w:rFonts w:ascii="Courier New" w:hAnsi="Courier New" w:eastAsia="Courier New"/>
-                <w:b w:val="0"/>
-                <w:sz w:val="17"/>
-              </w:rPr>
-              <w:t>gcc -Wall -Wextra -std=c11 -O2 -o tarsau tarsau.c</w:t>
-            </w:r>
-            <w:r>
-              <w:br/>
-            </w:r>
-            <w:r>
-              <w:rPr>
-                <w:rFonts w:ascii="Courier New" w:hAnsi="Courier New" w:eastAsia="Courier New"/>
-                <w:b w:val="0"/>
-                <w:sz w:val="17"/>
-              </w:rPr>
-            </w:r>
-            <w:r>
-              <w:br/>
-            </w:r>
-            <w:r>
-              <w:rPr>
-                <w:rFonts w:ascii="Courier New" w:hAnsi="Courier New" w:eastAsia="Courier New"/>
-                <w:b w:val="0"/>
-                <w:sz w:val="17"/>
-              </w:rPr>
-              <w:t>$ make test</w:t>
-            </w:r>
-            <w:r>
-              <w:br/>
-            </w:r>
-            <w:r>
-              <w:rPr>
-                <w:rFonts w:ascii="Courier New" w:hAnsi="Courier New" w:eastAsia="Courier New"/>
-                <w:b w:val="0"/>
-                <w:sz w:val="17"/>
-              </w:rPr>
-              <w:t>... diff kontrolleri hatasız tamamlandı</w:t>
-            </w:r>
-            <w:r>
-              <w:br/>
-            </w:r>
-            <w:r>
-              <w:rPr>
-                <w:rFonts w:ascii="Courier New" w:hAnsi="Courier New" w:eastAsia="Courier New"/>
-                <w:b w:val="0"/>
-                <w:sz w:val="17"/>
-              </w:rPr>
-            </w:r>
-            <w:r>
-              <w:br/>
-            </w:r>
-            <w:r>
-              <w:rPr>
-                <w:rFonts w:ascii="Courier New" w:hAnsi="Courier New" w:eastAsia="Courier New"/>
-                <w:b w:val="0"/>
-                <w:sz w:val="17"/>
-              </w:rPr>
-              <w:t>$ /tmp/tarsau_cases.../test-log.txt</w:t>
-            </w:r>
-            <w:r>
-              <w:br/>
-            </w:r>
-            <w:r>
-              <w:rPr>
-                <w:rFonts w:ascii="Courier New" w:hAnsi="Courier New" w:eastAsia="Courier New"/>
-                <w:b w:val="0"/>
-                <w:sz w:val="17"/>
-              </w:rPr>
-              <w:t>SUMMARY pass=22 fail=0</w:t>
-            </w:r>
-          </w:p>
-        </w:tc>
-      </w:tr>
-    </w:tbl>
     <w:p>
       <w:pPr>
-        <w:spacing w:before="0" w:after="40" w:line="264" w:lineRule="auto"/>
+        <w:pStyle w:val="ListBullet"/>
+        <w:spacing w:after="100" w:line="280" w:lineRule="auto"/>
       </w:pPr>
+      <w:r>
+        <w:rPr>
+          <w:rFonts w:ascii="Calibri" w:hAnsi="Calibri" w:eastAsia="Calibri"/>
+          <w:b w:val="0"/>
+          <w:sz w:val="22"/>
+        </w:rPr>
+        <w:t>GitHub deposunda temel proje iskeleti ve kaynak kod bulunmaktadır.</w:t>
+      </w:r>
+    </w:p>
+    <w:p>
+      <w:pPr>
+        <w:pStyle w:val="ListBullet"/>
+        <w:spacing w:after="100" w:line="280" w:lineRule="auto"/>
+      </w:pPr>
+      <w:r>
+        <w:rPr>
+          <w:rFonts w:ascii="Calibri" w:hAnsi="Calibri" w:eastAsia="Calibri"/>
+          <w:b w:val="0"/>
+          <w:sz w:val="22"/>
+        </w:rPr>
+        <w:t>Rapor, kod parçacıkları ve terminal çıktılarıyla geliştirme/test sürecini belgelemektedir.</w:t>
+      </w:r>
     </w:p>
     <w:sectPr>
       <w:pgSz w:w="12240" w:h="15840"/>

</xml_diff>